<commit_message>
Removed EDA notebook and visualization figures (unrelated to Student 1 tasks) and expanded Literature Notes to research-oriented publication standard
</commit_message>
<xml_diff>
--- a/REPORTS_AND_DOCS/Week1_Literature_Notes.docx
+++ b/REPORTS_AND_DOCS/Week1_Literature_Notes.docx
@@ -2,23 +2,19 @@
 <file path=word/document.xml><?xml version="1.0" encoding="utf-8"?>
 <w:document xmlns:wpc="http://schemas.microsoft.com/office/word/2010/wordprocessingCanvas" xmlns:mo="http://schemas.microsoft.com/office/mac/office/2008/main" xmlns:mc="http://schemas.openxmlformats.org/markup-compatibility/2006" xmlns:mv="urn:schemas-microsoft-com:mac:vml" xmlns:o="urn:schemas-microsoft-com:office:office" xmlns:r="http://schemas.openxmlformats.org/officeDocument/2006/relationships" xmlns:m="http://schemas.openxmlformats.org/officeDocument/2006/math" xmlns:v="urn:schemas-microsoft-com:vml" xmlns:wp14="http://schemas.microsoft.com/office/word/2010/wordprocessingDrawing" xmlns:wp="http://schemas.openxmlformats.org/drawingml/2006/wordprocessingDrawing" xmlns:w10="urn:schemas-microsoft-com:office:word" xmlns:w="http://schemas.openxmlformats.org/wordprocessingml/2006/main" xmlns:w14="http://schemas.microsoft.com/office/word/2010/wordml" xmlns:wpg="http://schemas.microsoft.com/office/word/2010/wordprocessingGroup" xmlns:wpi="http://schemas.microsoft.com/office/word/2010/wordprocessingInk" xmlns:wne="http://schemas.microsoft.com/office/word/2006/wordml" xmlns:wps="http://schemas.microsoft.com/office/word/2010/wordprocessingShape" mc:Ignorable="w14 wp14">
   <w:body>
-    <w:p/>
-    <w:p/>
-    <w:p/>
-    <w:p/>
-    <w:p/>
-    <w:p/>
     <w:p>
       <w:pPr>
         <w:jc w:val="center"/>
       </w:pPr>
       <w:r>
         <w:rPr>
+          <w:rFonts w:ascii="Times New Roman" w:hAnsi="Times New Roman"/>
           <w:b/>
-          <w:color w:val="003366"/>
-          <w:sz w:val="48"/>
+          <w:sz w:val="32"/>
         </w:rPr>
         <w:t>Week 1 Literature and Concept Notes</w:t>
+        <w:br/>
+        <w:t>GroundedNutriRec System Framework</w:t>
       </w:r>
     </w:p>
     <w:p>
@@ -27,26 +23,58 @@
       </w:pPr>
       <w:r>
         <w:rPr>
-          <w:color w:val="505050"/>
-          <w:sz w:val="28"/>
+          <w:i/>
+          <w:sz w:val="20"/>
         </w:rPr>
-        <w:t>GroundedNutriRec: Retrieval-Augmented Multi-Objective LLM Framework</w:t>
+        <w:t>Summer Internship Research Program</w:t>
         <w:br/>
-        <w:t>for Health-Aware and Explainable Food Recommendation</w:t>
+        <w:t>Topic: Health-Aware and Explainable Food Recommendation Systems Using Retrieval-Augmented LLMs</w:t>
+        <w:br/>
+        <w:t>Lead: Student 1 - Data + Sequential Recommendation Lead</w:t>
       </w:r>
     </w:p>
     <w:p>
       <w:pPr>
-        <w:jc w:val="center"/>
+        <w:spacing w:after="120" w:line="276" w:lineRule="auto"/>
       </w:pPr>
       <w:r>
         <w:rPr>
-          <w:sz w:val="24"/>
+          <w:rFonts w:ascii="Times New Roman" w:hAnsi="Times New Roman"/>
         </w:rPr>
-        <w:br/>
-        <w:t>Student 1 - Data + Sequential Recommendation Lead</w:t>
-        <w:br/>
-        <w:t>Prepared: June 04, 2026</w:t>
+        <w:t>**Course:** summer Internship Research Program</w:t>
+      </w:r>
+    </w:p>
+    <w:p>
+      <w:pPr>
+        <w:spacing w:after="120" w:line="276" w:lineRule="auto"/>
+      </w:pPr>
+      <w:r>
+        <w:rPr>
+          <w:rFonts w:ascii="Times New Roman" w:hAnsi="Times New Roman"/>
+        </w:rPr>
+        <w:t>**Topic:** Health-Aware and Explainable Food Recommendation Systems Using Retrieval-Augmented LLMs</w:t>
+      </w:r>
+    </w:p>
+    <w:p>
+      <w:pPr>
+        <w:spacing w:after="120" w:line="276" w:lineRule="auto"/>
+      </w:pPr>
+      <w:r>
+        <w:rPr>
+          <w:rFonts w:ascii="Times New Roman" w:hAnsi="Times New Roman"/>
+        </w:rPr>
+        <w:t>**Lead:** Student 1 - Data + Sequential Recommendation Lead</w:t>
+      </w:r>
+    </w:p>
+    <w:p>
+      <w:pPr>
+        <w:spacing w:after="120" w:line="276" w:lineRule="auto"/>
+      </w:pPr>
+      <w:r>
+        <w:rPr>
+          <w:rFonts w:ascii="Times New Roman" w:hAnsi="Times New Roman"/>
+        </w:rPr>
+        <w:t>**Context:** Foundational Week 1 Deliverables for the GroundedNutriRec system architecture</w:t>
       </w:r>
     </w:p>
     <w:p>
@@ -57,97 +85,418 @@
     <w:p>
       <w:pPr>
         <w:pStyle w:val="Heading1"/>
+        <w:keepNext/>
+        <w:spacing w:before="240" w:after="80"/>
       </w:pPr>
       <w:r>
-        <w:t>Table of Contents</w:t>
-      </w:r>
-    </w:p>
-    <w:p>
-      <w:pPr>
-        <w:pStyle w:val="ListNumber"/>
-      </w:pPr>
-      <w:r>
+        <w:rPr>
+          <w:rFonts w:ascii="Times New Roman" w:hAnsi="Times New Roman"/>
+          <w:b/>
+          <w:color w:val="000000"/>
+          <w:sz w:val="26"/>
+        </w:rPr>
         <w:t>1. Recommender Systems</w:t>
       </w:r>
     </w:p>
     <w:p>
       <w:pPr>
-        <w:pStyle w:val="ListNumber"/>
+        <w:pStyle w:val="Heading2"/>
+        <w:keepNext/>
+        <w:spacing w:before="240" w:after="80"/>
       </w:pPr>
       <w:r>
-        <w:t>2. Top-K Recommendation Evaluation Metrics</w:t>
+        <w:rPr>
+          <w:rFonts w:ascii="Times New Roman" w:hAnsi="Times New Roman"/>
+          <w:b/>
+          <w:color w:val="000000"/>
+          <w:sz w:val="24"/>
+        </w:rPr>
+        <w:t>1.1 Brief Introduction</w:t>
       </w:r>
     </w:p>
     <w:p>
       <w:pPr>
-        <w:pStyle w:val="ListNumber"/>
+        <w:spacing w:after="120" w:line="276" w:lineRule="auto"/>
       </w:pPr>
       <w:r>
-        <w:t>3. Food Recommendation</w:t>
+        <w:rPr>
+          <w:rFonts w:ascii="Times New Roman" w:hAnsi="Times New Roman"/>
+        </w:rPr>
+        <w:t>Recommender systems are algorithmic frameworks designed to address information overload by suggesting items (such as movies, products, or food recipes) that align with a user's latent preferences. These systems analyze historical interaction data and item/user metadata to model and predict the utility of unseen items [Adomavicius and Tuzhilin, 2005].</w:t>
       </w:r>
     </w:p>
     <w:p>
       <w:pPr>
-        <w:pStyle w:val="ListNumber"/>
+        <w:pStyle w:val="Heading2"/>
+        <w:keepNext/>
+        <w:spacing w:before="240" w:after="80"/>
       </w:pPr>
       <w:r>
-        <w:t>4. Health-Aware Recommendation</w:t>
+        <w:rPr>
+          <w:rFonts w:ascii="Times New Roman" w:hAnsi="Times New Roman"/>
+          <w:b/>
+          <w:color w:val="000000"/>
+          <w:sz w:val="24"/>
+        </w:rPr>
+        <w:t>1.2 Detailed Explanation</w:t>
       </w:r>
     </w:p>
     <w:p>
       <w:pPr>
-        <w:pStyle w:val="ListNumber"/>
+        <w:spacing w:after="120" w:line="276" w:lineRule="auto"/>
       </w:pPr>
       <w:r>
-        <w:t>5. Explainable AI in Recommendation</w:t>
+        <w:rPr>
+          <w:rFonts w:ascii="Times New Roman" w:hAnsi="Times New Roman"/>
+        </w:rPr>
+        <w:t>Recommender systems map user profiles to item catalogs to output ranked recommendation lists. Formally, let $U$ be the set of users and $I$ be the set of items. The objective is to learn a utility function $R: U \times I \to S$ that predicts the rating or interaction probability of user $u$ on item $i$, where $S$ is a totally ordered set (e.g., rating scale $[0, 5]$ or binary click/no-click). The core methodologies are:</w:t>
       </w:r>
     </w:p>
     <w:p>
       <w:pPr>
-        <w:pStyle w:val="ListNumber"/>
+        <w:pStyle w:val="ListBullet"/>
+        <w:spacing w:after="40"/>
       </w:pPr>
       <w:r>
-        <w:t>6. Large Language Models (LLMs)</w:t>
+        <w:rPr>
+          <w:rFonts w:ascii="Times New Roman" w:hAnsi="Times New Roman"/>
+        </w:rPr>
+        <w:t>**Collaborative Filtering (CF):** Relying solely on historical interaction patterns (implicit clicks or explicit ratings) between users and items. Collaborative filtering operates on the assumption that users who agreed on items in the past will agree in the future [Sarwar et al., 2001].</w:t>
       </w:r>
     </w:p>
     <w:p>
       <w:pPr>
-        <w:pStyle w:val="ListNumber"/>
+        <w:pStyle w:val="ListBullet"/>
+        <w:spacing w:after="40"/>
       </w:pPr>
       <w:r>
-        <w:t>7. Retrieval-Augmented Generation (RAG)</w:t>
+        <w:rPr>
+          <w:rFonts w:ascii="Times New Roman" w:hAnsi="Times New Roman"/>
+        </w:rPr>
+        <w:t>*Matrix Factorization (MF):* Learns low-dimensional latent vectors $p_u, q_i \in \mathbb{R}^d$ for users and items, predicting the rating as:</w:t>
       </w:r>
     </w:p>
     <w:p>
       <w:pPr>
-        <w:pStyle w:val="ListNumber"/>
+        <w:spacing w:before="120" w:after="120"/>
+        <w:jc w:val="center"/>
       </w:pPr>
       <w:r>
-        <w:t>8. Hallucination in LLMs</w:t>
+        <w:rPr>
+          <w:rFonts w:ascii="Times New Roman" w:hAnsi="Times New Roman"/>
+          <w:i/>
+          <w:sz w:val="22"/>
+        </w:rPr>
+        <w:t>\hat{r}_{u,i} = \mu + b_u + b_i + p_u^T q_i</w:t>
       </w:r>
     </w:p>
     <w:p>
       <w:pPr>
-        <w:pStyle w:val="ListNumber"/>
+        <w:spacing w:after="120" w:line="276" w:lineRule="auto"/>
       </w:pPr>
       <w:r>
-        <w:t>9. Sequential Recommendation</w:t>
+        <w:rPr>
+          <w:rFonts w:ascii="Times New Roman" w:hAnsi="Times New Roman"/>
+        </w:rPr>
+        <w:t>where $\mu$ is the global bias, $b_u$ is the user bias, and $b_i$ is the item bias [Koren et al., 2009].</w:t>
       </w:r>
     </w:p>
     <w:p>
       <w:pPr>
-        <w:pStyle w:val="ListNumber"/>
+        <w:pStyle w:val="ListBullet"/>
+        <w:spacing w:after="40"/>
       </w:pPr>
       <w:r>
-        <w:t>10. Research Gap: What GroundedNutriRec Addresses</w:t>
+        <w:rPr>
+          <w:rFonts w:ascii="Times New Roman" w:hAnsi="Times New Roman"/>
+        </w:rPr>
+        <w:t>*State-of-the-Art Deep CF:* Models like Neural Collaborative Filtering (NCF) replace dot products with neural networks, and Graph Neural Networks (e.g., LightGCN) capture high-order collaborative relationships via node embeddings over bipartite graphs [He et al., 2017].</w:t>
       </w:r>
     </w:p>
     <w:p>
       <w:pPr>
-        <w:pStyle w:val="ListNumber"/>
+        <w:pStyle w:val="ListBullet"/>
+        <w:spacing w:after="40"/>
       </w:pPr>
       <w:r>
-        <w:t>References</w:t>
+        <w:rPr>
+          <w:rFonts w:ascii="Times New Roman" w:hAnsi="Times New Roman"/>
+        </w:rPr>
+        <w:t>**Content-Based Filtering (CBF):** Recommends items similar to those the user has interacted with in the past based on item descriptors (features) [Lops et al., 2011]. Item profiles $x_i$ and user preferences $\theta_u$ are mapped to a shared feature space. The score is computed using similarity metrics like cosine similarity:</w:t>
+      </w:r>
+    </w:p>
+    <w:p>
+      <w:pPr>
+        <w:spacing w:before="120" w:after="120"/>
+        <w:jc w:val="center"/>
+      </w:pPr>
+      <w:r>
+        <w:rPr>
+          <w:rFonts w:ascii="Times New Roman" w:hAnsi="Times New Roman"/>
+          <w:i/>
+          <w:sz w:val="22"/>
+        </w:rPr>
+        <w:t>\text{sim}(u, i) = \frac{\theta_u \cdot x_i}{\|\theta_u\| \|x_i\|}</w:t>
+      </w:r>
+    </w:p>
+    <w:p>
+      <w:pPr>
+        <w:pStyle w:val="ListBullet"/>
+        <w:spacing w:after="40"/>
+      </w:pPr>
+      <w:r>
+        <w:rPr>
+          <w:rFonts w:ascii="Times New Roman" w:hAnsi="Times New Roman"/>
+        </w:rPr>
+        <w:t>**Hybrid Systems:** Integrate collaborative and content approaches (via weighted combination, switching, or feature cascades) to mitigate weaknesses such as data sparsity and cold-start.</w:t>
+      </w:r>
+    </w:p>
+    <w:p>
+      <w:pPr>
+        <w:pStyle w:val="Heading2"/>
+        <w:keepNext/>
+        <w:spacing w:before="240" w:after="80"/>
+      </w:pPr>
+      <w:r>
+        <w:rPr>
+          <w:rFonts w:ascii="Times New Roman" w:hAnsi="Times New Roman"/>
+          <w:b/>
+          <w:color w:val="000000"/>
+          <w:sz w:val="24"/>
+        </w:rPr>
+        <w:t>1.3 Examples</w:t>
+      </w:r>
+    </w:p>
+    <w:p>
+      <w:pPr>
+        <w:pStyle w:val="ListBullet"/>
+        <w:spacing w:after="40"/>
+      </w:pPr>
+      <w:r>
+        <w:rPr>
+          <w:rFonts w:ascii="Times New Roman" w:hAnsi="Times New Roman"/>
+        </w:rPr>
+        <w:t>*Collaborative filtering:* Netflix suggesting movies based on rating matrices factorized using Alternating Least Squares (ALS) or Singular Value Decomposition (SVD).</w:t>
+      </w:r>
+    </w:p>
+    <w:p>
+      <w:pPr>
+        <w:pStyle w:val="ListBullet"/>
+        <w:spacing w:after="40"/>
+      </w:pPr>
+      <w:r>
+        <w:rPr>
+          <w:rFonts w:ascii="Times New Roman" w:hAnsi="Times New Roman"/>
+        </w:rPr>
+        <w:t>*Content-based filtering:* Pandora recommending songs with acoustic attributes similar to the user's thumbs-up history.</w:t>
+      </w:r>
+    </w:p>
+    <w:p>
+      <w:pPr>
+        <w:pStyle w:val="Heading2"/>
+        <w:keepNext/>
+        <w:spacing w:before="240" w:after="80"/>
+      </w:pPr>
+      <w:r>
+        <w:rPr>
+          <w:rFonts w:ascii="Times New Roman" w:hAnsi="Times New Roman"/>
+          <w:b/>
+          <w:color w:val="000000"/>
+          <w:sz w:val="24"/>
+        </w:rPr>
+        <w:t>1.4 Advantages</w:t>
+      </w:r>
+    </w:p>
+    <w:p>
+      <w:pPr>
+        <w:pStyle w:val="ListBullet"/>
+        <w:spacing w:after="40"/>
+      </w:pPr>
+      <w:r>
+        <w:rPr>
+          <w:rFonts w:ascii="Times New Roman" w:hAnsi="Times New Roman"/>
+        </w:rPr>
+        <w:t>Personalizes content, increasing user satisfaction, platform engagement, and retention [Konstan and Riedl, 2012].</w:t>
+      </w:r>
+    </w:p>
+    <w:p>
+      <w:pPr>
+        <w:pStyle w:val="ListBullet"/>
+        <w:spacing w:after="40"/>
+      </w:pPr>
+      <w:r>
+        <w:rPr>
+          <w:rFonts w:ascii="Times New Roman" w:hAnsi="Times New Roman"/>
+        </w:rPr>
+        <w:t>Leverages the "long tail" by exposing niche items that users might not discover through manual searching.</w:t>
+      </w:r>
+    </w:p>
+    <w:p>
+      <w:pPr>
+        <w:pStyle w:val="ListBullet"/>
+        <w:spacing w:after="40"/>
+      </w:pPr>
+      <w:r>
+        <w:rPr>
+          <w:rFonts w:ascii="Times New Roman" w:hAnsi="Times New Roman"/>
+        </w:rPr>
+        <w:t>Simplifies decision-making by filtering out irrelevant choices, reducing cognitive friction.</w:t>
+      </w:r>
+    </w:p>
+    <w:p>
+      <w:pPr>
+        <w:pStyle w:val="Heading2"/>
+        <w:keepNext/>
+        <w:spacing w:before="240" w:after="80"/>
+      </w:pPr>
+      <w:r>
+        <w:rPr>
+          <w:rFonts w:ascii="Times New Roman" w:hAnsi="Times New Roman"/>
+          <w:b/>
+          <w:color w:val="000000"/>
+          <w:sz w:val="24"/>
+        </w:rPr>
+        <w:t>1.5 Disadvantages</w:t>
+      </w:r>
+    </w:p>
+    <w:p>
+      <w:pPr>
+        <w:pStyle w:val="ListBullet"/>
+        <w:spacing w:after="40"/>
+      </w:pPr>
+      <w:r>
+        <w:rPr>
+          <w:rFonts w:ascii="Times New Roman" w:hAnsi="Times New Roman"/>
+        </w:rPr>
+        <w:t>**Cold-Start Problem:** Incapable of recommending new items with no interaction history (item cold-start) or to new users with no profile history (user cold-start).</w:t>
+      </w:r>
+    </w:p>
+    <w:p>
+      <w:pPr>
+        <w:pStyle w:val="ListBullet"/>
+        <w:spacing w:after="40"/>
+      </w:pPr>
+      <w:r>
+        <w:rPr>
+          <w:rFonts w:ascii="Times New Roman" w:hAnsi="Times New Roman"/>
+        </w:rPr>
+        <w:t>**Data Sparsity:** Interaction matrices are typically sparse (sparsity $&gt;99\%$), causing degradation in collaborative model accuracy.</w:t>
+      </w:r>
+    </w:p>
+    <w:p>
+      <w:pPr>
+        <w:pStyle w:val="ListBullet"/>
+        <w:spacing w:after="40"/>
+      </w:pPr>
+      <w:r>
+        <w:rPr>
+          <w:rFonts w:ascii="Times New Roman" w:hAnsi="Times New Roman"/>
+        </w:rPr>
+        <w:t>**Popularity Bias:** Standard models tend to over-recommend popular items, leading to a feedback loop that neglects diverse items.</w:t>
+      </w:r>
+    </w:p>
+    <w:p>
+      <w:pPr>
+        <w:pStyle w:val="Heading2"/>
+        <w:keepNext/>
+        <w:spacing w:before="240" w:after="80"/>
+      </w:pPr>
+      <w:r>
+        <w:rPr>
+          <w:rFonts w:ascii="Times New Roman" w:hAnsi="Times New Roman"/>
+          <w:b/>
+          <w:color w:val="000000"/>
+          <w:sz w:val="24"/>
+        </w:rPr>
+        <w:t>1.6 Use Cases</w:t>
+      </w:r>
+    </w:p>
+    <w:p>
+      <w:pPr>
+        <w:pStyle w:val="ListBullet"/>
+        <w:spacing w:after="40"/>
+      </w:pPr>
+      <w:r>
+        <w:rPr>
+          <w:rFonts w:ascii="Times New Roman" w:hAnsi="Times New Roman"/>
+        </w:rPr>
+        <w:t>E-commerce platforms suggesting related products or bundling recommendations.</w:t>
+      </w:r>
+    </w:p>
+    <w:p>
+      <w:pPr>
+        <w:pStyle w:val="ListBullet"/>
+        <w:spacing w:after="40"/>
+      </w:pPr>
+      <w:r>
+        <w:rPr>
+          <w:rFonts w:ascii="Times New Roman" w:hAnsi="Times New Roman"/>
+        </w:rPr>
+        <w:t>Streaming providers dynamically structuring homepages based on user history.</w:t>
+      </w:r>
+    </w:p>
+    <w:p>
+      <w:pPr>
+        <w:pStyle w:val="ListBullet"/>
+        <w:spacing w:after="40"/>
+      </w:pPr>
+      <w:r>
+        <w:rPr>
+          <w:rFonts w:ascii="Times New Roman" w:hAnsi="Times New Roman"/>
+        </w:rPr>
+        <w:t>Social networks prioritizing news feeds and connection suggestions.</w:t>
+      </w:r>
+    </w:p>
+    <w:p>
+      <w:pPr>
+        <w:pStyle w:val="Heading2"/>
+        <w:keepNext/>
+        <w:spacing w:before="240" w:after="80"/>
+      </w:pPr>
+      <w:r>
+        <w:rPr>
+          <w:rFonts w:ascii="Times New Roman" w:hAnsi="Times New Roman"/>
+          <w:b/>
+          <w:color w:val="000000"/>
+          <w:sz w:val="24"/>
+        </w:rPr>
+        <w:t>1.7 Limitations</w:t>
+      </w:r>
+    </w:p>
+    <w:p>
+      <w:pPr>
+        <w:pStyle w:val="ListBullet"/>
+        <w:spacing w:after="40"/>
+      </w:pPr>
+      <w:r>
+        <w:rPr>
+          <w:rFonts w:ascii="Times New Roman" w:hAnsi="Times New Roman"/>
+        </w:rPr>
+        <w:t>Models cannot recommend items outside the catalog or handle items lacking descriptive features in content-based scenarios.</w:t>
+      </w:r>
+    </w:p>
+    <w:p>
+      <w:pPr>
+        <w:pStyle w:val="ListBullet"/>
+        <w:spacing w:after="40"/>
+      </w:pPr>
+      <w:r>
+        <w:rPr>
+          <w:rFonts w:ascii="Times New Roman" w:hAnsi="Times New Roman"/>
+        </w:rPr>
+        <w:t>Systems are sensitive to noisy data or malicious shilling attacks (where fake reviews bias ratings).</w:t>
+      </w:r>
+    </w:p>
+    <w:p>
+      <w:pPr>
+        <w:pStyle w:val="ListBullet"/>
+        <w:spacing w:after="40"/>
+      </w:pPr>
+      <w:r>
+        <w:rPr>
+          <w:rFonts w:ascii="Times New Roman" w:hAnsi="Times New Roman"/>
+        </w:rPr>
+        <w:t>Incapable of adjusting dynamically to rapid context changes (e.g., a sudden change in user search intent) without session-aware modeling.</w:t>
       </w:r>
     </w:p>
     <w:p>
@@ -158,981 +507,404 @@
     <w:p>
       <w:pPr>
         <w:pStyle w:val="Heading1"/>
+        <w:keepNext/>
+        <w:spacing w:before="240" w:after="80"/>
       </w:pPr>
       <w:r>
-        <w:t>1. Recommender Systems</w:t>
+        <w:rPr>
+          <w:rFonts w:ascii="Times New Roman" w:hAnsi="Times New Roman"/>
+          <w:b/>
+          <w:color w:val="000000"/>
+          <w:sz w:val="26"/>
+        </w:rPr>
+        <w:t>2. Food Recommendation Systems</w:t>
       </w:r>
     </w:p>
     <w:p>
       <w:pPr>
         <w:pStyle w:val="Heading2"/>
+        <w:keepNext/>
+        <w:spacing w:before="240" w:after="80"/>
       </w:pPr>
       <w:r>
-        <w:t>Definition</w:t>
+        <w:rPr>
+          <w:rFonts w:ascii="Times New Roman" w:hAnsi="Times New Roman"/>
+          <w:b/>
+          <w:color w:val="000000"/>
+          <w:sz w:val="24"/>
+        </w:rPr>
+        <w:t>2.1 Brief Introduction</w:t>
       </w:r>
     </w:p>
     <w:p>
+      <w:pPr>
+        <w:spacing w:after="120" w:line="276" w:lineRule="auto"/>
+      </w:pPr>
       <w:r>
-        <w:t>Recommender systems are algorithms that predict user preferences for items they have not yet interacted with, enabling personalized content delivery at scale. They are broadly categorized into five taxonomies:</w:t>
-        <w:br/>
-        <w:br/>
-        <w:t>Collaborative Filtering (CF): Exploits the collective behavior of users. User-based CF identifies users with similar interaction histories and recommends items liked by similar users. Item-based CF identifies items that co-occur in user histories. Matrix factorization methods (SVD, ALS) decompose the sparse user-item matrix into latent factor matrices to predict missing ratings.</w:t>
-        <w:br/>
-        <w:br/>
-        <w:t>Content-Based Filtering: Recommends items similar to those a user has previously liked, based on item features (e.g., ingredients, tags, nutritional profile). It constructs item profiles using TF-IDF, word embeddings, or sentence transformers, and computes cosine similarity between the user profile vector and candidate item vectors.</w:t>
-        <w:br/>
-        <w:br/>
-        <w:t>Hybrid Systems: Combine collaborative and content-based signals to mitigate the weaknesses of each (cold-start for CF, over-specialization for content-based). Strategies include weighted combination, feature augmentation, and cascade approaches.</w:t>
-        <w:br/>
-        <w:br/>
-        <w:t>Knowledge-Based Systems: Use explicit domain knowledge (e.g., dietary rules, allergen constraints) to filter or rank items. These are critical in health-aware food recommendation where nutritional rules must be enforced regardless of user preference.</w:t>
-        <w:br/>
-        <w:br/>
-        <w:t>Sequential Recommendation: Models the temporal ordering of user interactions to predict the next item. Methods range from Markov Chains to deep neural approaches like GRU4Rec and SASRec.</w:t>
+        <w:rPr>
+          <w:rFonts w:ascii="Times New Roman" w:hAnsi="Times New Roman"/>
+        </w:rPr>
+        <w:t>Food recommendation systems are specialized information filtering frameworks that suggest recipes, meal plans, or grocery products. Unlike generic recommenders, they must adapt to biochemical constraints, dietary preferences, and complex cooking instructions [Trattner and Elsweiler, 2017].</w:t>
       </w:r>
     </w:p>
     <w:p>
       <w:pPr>
         <w:pStyle w:val="Heading2"/>
+        <w:keepNext/>
+        <w:spacing w:before="240" w:after="80"/>
       </w:pPr>
       <w:r>
-        <w:t>Core Working Principle</w:t>
+        <w:rPr>
+          <w:rFonts w:ascii="Times New Roman" w:hAnsi="Times New Roman"/>
+          <w:b/>
+          <w:color w:val="000000"/>
+          <w:sz w:val="24"/>
+        </w:rPr>
+        <w:t>2.2 Detailed Explanation</w:t>
       </w:r>
     </w:p>
     <w:p>
+      <w:pPr>
+        <w:spacing w:after="120" w:line="276" w:lineRule="auto"/>
+      </w:pPr>
       <w:r>
-        <w:t>At the core of collaborative filtering lies the user-item interaction matrix R of dimensions |U| x |I|, where R[u,i] represents user u's feedback on item i. Most entries are missing (the matrix is extremely sparse). The goal is to predict R[u,i] for unobserved pairs. Matrix factorization decomposes R into two low-rank matrices: R approximately equals P * Q^T, where P (|U| x k) represents user latent factors and Q (|I| x k) represents item latent factors. The predicted rating is the dot product of the corresponding user and item factor vectors.</w:t>
-        <w:br/>
-        <w:br/>
-        <w:t>Implicit feedback extends this framework by treating interactions (clicks, purchases, views) as binary signals rather than explicit ratings. The distinction between explicit feedback (user provides a numerical rating) and implicit feedback (system infers preference from behavior) is fundamental. In the Food.com dataset, rating &gt;= 4 is used as an implicit positive signal (liked=1), while rating &lt; 4 indicates dislike (liked=0). Rating=0 represents no explicit feedback and must be handled separately.</w:t>
-        <w:br/>
-        <w:br/>
-        <w:t>The cold-start problem occurs when new users or new items have insufficient interaction history for CF to produce meaningful predictions. Content-based and knowledge-based methods address this by relying on item metadata rather than interaction history.</w:t>
+        <w:rPr>
+          <w:rFonts w:ascii="Times New Roman" w:hAnsi="Times New Roman"/>
+        </w:rPr>
+        <w:t>Food recommendation extends beyond traditional user-item matching by incorporating culinary attributes and consumption behaviors. The system must process hierarchical recipe inputs consisting of:</w:t>
       </w:r>
     </w:p>
     <w:p>
       <w:pPr>
-        <w:pStyle w:val="Heading2"/>
+        <w:pStyle w:val="ListBullet"/>
+        <w:spacing w:after="40"/>
       </w:pPr>
       <w:r>
-        <w:t>Relevance to GroundedNutriRec</w:t>
+        <w:rPr>
+          <w:rFonts w:ascii="Times New Roman" w:hAnsi="Times New Roman"/>
+        </w:rPr>
+        <w:t>**Title and Description:** Free-form text requiring Natural Language Processing (NLP) to extract semantic themes.</w:t>
       </w:r>
     </w:p>
     <w:p>
+      <w:pPr>
+        <w:pStyle w:val="ListBullet"/>
+        <w:spacing w:after="40"/>
+      </w:pPr>
       <w:r>
-        <w:t>GroundedNutriRec uses collaborative filtering as the preference score component of its multi-objective ranking function. The user-item interaction matrix from Food.com forms the foundation of all baseline models in Week 3. The implicit feedback derivation (rating &gt;= 4 -&gt; liked=1) directly enables binary classification approaches in the CF pipeline. Sequential recommendation (GRU4Rec/SASRec) extends this by modeling the temporal order of user-recipe interactions to predict the next recipe a user will engage with.</w:t>
+        <w:rPr>
+          <w:rFonts w:ascii="Times New Roman" w:hAnsi="Times New Roman"/>
+        </w:rPr>
+        <w:t>**Structured Ingredient Lists:** Ingredient naming conventions vary widely. Named Entity Recognition (NER) is used to map ingredients to standard vocabulary indices (e.g., mapping "yellow onions" and "chopped onion" to a single ingredient node).</w:t>
       </w:r>
     </w:p>
     <w:p>
       <w:pPr>
-        <w:pStyle w:val="Heading2"/>
+        <w:pStyle w:val="ListBullet"/>
+        <w:spacing w:after="40"/>
       </w:pPr>
       <w:r>
-        <w:t>Formula / Concrete Example</w:t>
+        <w:rPr>
+          <w:rFonts w:ascii="Times New Roman" w:hAnsi="Times New Roman"/>
+        </w:rPr>
+        <w:t>**Instructional Steps:** Sequential steps representing preparation complexity and time.</w:t>
       </w:r>
     </w:p>
     <w:p>
+      <w:pPr>
+        <w:spacing w:after="120" w:line="276" w:lineRule="auto"/>
+      </w:pPr>
       <w:r>
-        <w:t>User-item matrix sparsity calculation:</w:t>
-        <w:br/>
-        <w:t xml:space="preserve">  Sparsity = 1 - (number_of_interactions / (number_of_users x number_of_recipes))</w:t>
-        <w:br/>
-        <w:br/>
-        <w:t>For Food.com: with approximately 226,570 users, 231,637 recipes, and 1,132,367 interactions:</w:t>
-        <w:br/>
-        <w:t xml:space="preserve">  Sparsity = 1 - (1,132,367 / (226,570 x 231,637)) = 1 - (1,132,367 / 52,480,843,090) = 99.998%</w:t>
-        <w:br/>
-        <w:br/>
-        <w:t>This extreme sparsity (99.998%) means that each user has rated fewer than 0.002% of all available recipes, which is why matrix factorization with latent factors is essential rather than direct nearest-neighbor lookup.</w:t>
-      </w:r>
-    </w:p>
-    <w:p/>
-    <w:p>
-      <w:pPr>
-        <w:pStyle w:val="Heading1"/>
-      </w:pPr>
-      <w:r>
-        <w:t>2. Top-K Recommendation Evaluation Metrics</w:t>
+        <w:rPr>
+          <w:rFonts w:ascii="Times New Roman" w:hAnsi="Times New Roman"/>
+        </w:rPr>
+        <w:t>Key technical challenges in food recommender architectures include:</w:t>
       </w:r>
     </w:p>
     <w:p>
       <w:pPr>
-        <w:pStyle w:val="Heading2"/>
+        <w:spacing w:after="60"/>
+        <w:ind w:left="360"/>
       </w:pPr>
       <w:r>
-        <w:t>Definition</w:t>
+        <w:rPr>
+          <w:rFonts w:ascii="Times New Roman" w:hAnsi="Times New Roman"/>
+        </w:rPr>
+        <w:t>1. **Taste Profiles and Flavor Pairing:** Traditional content representations fail to capture chemical flavor compounds. Advanced models construct flavor graphs representing ingredient combinations (e.g., flavor pairing hypothesis) to model recipe compatibility [Ahn et al., 2011].</w:t>
       </w:r>
     </w:p>
     <w:p>
+      <w:pPr>
+        <w:spacing w:after="60"/>
+        <w:ind w:left="360"/>
+      </w:pPr>
       <w:r>
-        <w:t>Top-K evaluation metrics measure the quality of a ranked list of K recommended items against the set of items the user actually interacted with (ground truth). These metrics are standard in information retrieval and recommendation research.</w:t>
-        <w:br/>
-        <w:br/>
-        <w:t>Precision@K: The fraction of recommended items in the top-K list that are relevant.</w:t>
-        <w:br/>
-        <w:t xml:space="preserve">  Precision@K = |relevant items in top-K| / K</w:t>
-        <w:br/>
-        <w:br/>
-        <w:t>Recall@K: The fraction of all relevant items that appear in the top-K list.</w:t>
-        <w:br/>
-        <w:t xml:space="preserve">  Recall@K = |relevant items in top-K| / |total relevant items|</w:t>
-        <w:br/>
-        <w:br/>
-        <w:t>HitRate@K: Binary indicator of whether at least one relevant item appears in the top-K list, averaged across all users.</w:t>
-        <w:br/>
-        <w:t xml:space="preserve">  HitRate@K = (1/|U|) * sum(1 if top-K contains at least one relevant item for user u, else 0)</w:t>
-        <w:br/>
-        <w:br/>
-        <w:t>NDCG@K (Normalized Discounted Cumulative Gain): Measures ranking quality by giving higher credit to relevant items that appear earlier in the list.</w:t>
-        <w:br/>
-        <w:t xml:space="preserve">  DCG@K = sum(rel_i / log2(i+1)) for i=1 to K</w:t>
-        <w:br/>
-        <w:t xml:space="preserve">  NDCG@K = DCG@K / IDCG@K</w:t>
-        <w:br/>
-        <w:t xml:space="preserve">  where IDCG@K is the ideal DCG (perfect ranking)</w:t>
-        <w:br/>
-        <w:br/>
-        <w:t>MRR@K (Mean Reciprocal Rank): The average of the reciprocal of the rank of the first relevant item across all users.</w:t>
-        <w:br/>
-        <w:t xml:space="preserve">  MRR@K = (1/|U|) * sum(1/rank_of_first_relevant_item_for_user_u)</w:t>
+        <w:rPr>
+          <w:rFonts w:ascii="Times New Roman" w:hAnsi="Times New Roman"/>
+        </w:rPr>
+        <w:t>2. **Session-Based Patterns:** User food consumption is highly structured around eating schedules (breakfast, lunch, dinner) and seasonal patterns. Sequential modeling (e.g., Markov chains or recurrent neural networks) is necessary to avoid recommending heavy dinner recipes in the morning.</w:t>
       </w:r>
     </w:p>
     <w:p>
       <w:pPr>
-        <w:pStyle w:val="Heading2"/>
+        <w:spacing w:after="60"/>
+        <w:ind w:left="360"/>
       </w:pPr>
       <w:r>
-        <w:t>Core Working Principle</w:t>
+        <w:rPr>
+          <w:rFonts w:ascii="Times New Roman" w:hAnsi="Times New Roman"/>
+        </w:rPr>
+        <w:t>3. **Multi-User Aggregation:** Food is frequently prepared for groups (families, social gatherings), requiring group recommendation algorithms that aggregate individual utility functions to maximize collective satisfaction while respecting critical constraints (such as allergies).</w:t>
       </w:r>
     </w:p>
     <w:p>
+      <w:pPr>
+        <w:pStyle w:val="Heading2"/>
+        <w:keepNext/>
+        <w:spacing w:before="240" w:after="80"/>
+      </w:pPr>
       <w:r>
-        <w:t>Each metric captures a different aspect of recommendation quality. Precision@K penalizes irrelevant recommendations and is most useful when the recommendation list is small. Recall@K measures coverage and is critical when users have many relevant items. NDCG@K is position-aware and rewards systems that place relevant items at the top of the list. MRR@K focuses exclusively on the first relevant item and is appropriate when users typically act on only the top result. HitRate@K is the coarsest metric but is useful as a minimum viability check.</w:t>
+        <w:rPr>
+          <w:rFonts w:ascii="Times New Roman" w:hAnsi="Times New Roman"/>
+          <w:b/>
+          <w:color w:val="000000"/>
+          <w:sz w:val="24"/>
+        </w:rPr>
+        <w:t>2.3 Examples</w:t>
       </w:r>
     </w:p>
     <w:p>
       <w:pPr>
-        <w:pStyle w:val="Heading2"/>
+        <w:pStyle w:val="ListBullet"/>
+        <w:spacing w:after="40"/>
       </w:pPr>
       <w:r>
-        <w:t>Relevance to GroundedNutriRec</w:t>
+        <w:rPr>
+          <w:rFonts w:ascii="Times New Roman" w:hAnsi="Times New Roman"/>
+        </w:rPr>
+        <w:t>Recommending a vegetarian Italian recipe (e.g., "Eggplant Parmesan") to a user who has frequently liked pasta dishes and possesses eggplant and tomato sauce.</w:t>
       </w:r>
     </w:p>
     <w:p>
+      <w:pPr>
+        <w:pStyle w:val="ListBullet"/>
+        <w:spacing w:after="40"/>
+      </w:pPr>
       <w:r>
-        <w:t>In the GroundedNutriRec evaluation framework, NDCG@K is the primary metric because food recommendation is inherently a ranking problem where the order of suggestions matters (a user is most likely to cook the first recommended recipe). Precision@K and Recall@K provide complementary perspectives on relevance coverage. All baseline models (popularity, content-based, CF) and the multi-objective ranking models will be evaluated using these metrics at K=5 and K=10.</w:t>
+        <w:rPr>
+          <w:rFonts w:ascii="Times New Roman" w:hAnsi="Times New Roman"/>
+        </w:rPr>
+        <w:t>Predicting a user's next meal sequence (recommending a light lunch after a heavy breakfast interaction).</w:t>
       </w:r>
     </w:p>
     <w:p>
       <w:pPr>
         <w:pStyle w:val="Heading2"/>
+        <w:keepNext/>
+        <w:spacing w:before="240" w:after="80"/>
       </w:pPr>
       <w:r>
-        <w:t>Formula / Concrete Example</w:t>
+        <w:rPr>
+          <w:rFonts w:ascii="Times New Roman" w:hAnsi="Times New Roman"/>
+          <w:b/>
+          <w:color w:val="000000"/>
+          <w:sz w:val="24"/>
+        </w:rPr>
+        <w:t>2.4 Advantages</w:t>
       </w:r>
     </w:p>
     <w:p>
+      <w:pPr>
+        <w:pStyle w:val="ListBullet"/>
+        <w:spacing w:after="40"/>
+      </w:pPr>
       <w:r>
-        <w:t>Concrete example for a single user:</w:t>
-        <w:br/>
-        <w:t xml:space="preserve">  Ground truth relevant items: {R1, R5, R8}</w:t>
-        <w:br/>
-        <w:t xml:space="preserve">  Recommended top-5: [R3, R1, R7, R5, R2]</w:t>
-        <w:br/>
-        <w:br/>
-        <w:t xml:space="preserve">  Precision@5 = 2/5 = 0.40</w:t>
-        <w:br/>
-        <w:t xml:space="preserve">  Recall@5 = 2/3 = 0.67</w:t>
-        <w:br/>
-        <w:t xml:space="preserve">  HitRate@5 = 1 (at least one relevant item present)</w:t>
-        <w:br/>
-        <w:t xml:space="preserve">  DCG@5 = 0/log2(2) + 1/log2(3) + 0/log2(4) + 1/log2(5) + 0/log2(6) = 0.631 + 0.431 = 1.062</w:t>
-        <w:br/>
-        <w:t xml:space="preserve">  IDCG@5 = 1/log2(2) + 1/log2(3) + 1/log2(4) = 1.0 + 0.631 + 0.5 = 2.131</w:t>
-        <w:br/>
-        <w:t xml:space="preserve">  NDCG@5 = 1.062 / 2.131 = 0.498</w:t>
-        <w:br/>
-        <w:t xml:space="preserve">  MRR@5 = 1/2 = 0.5 (first relevant item R1 is at rank 2)</w:t>
-      </w:r>
-    </w:p>
-    <w:p/>
-    <w:p>
-      <w:pPr>
-        <w:pStyle w:val="Heading1"/>
-      </w:pPr>
-      <w:r>
-        <w:t>3. Food Recommendation</w:t>
+        <w:rPr>
+          <w:rFonts w:ascii="Times New Roman" w:hAnsi="Times New Roman"/>
+        </w:rPr>
+        <w:t>Facilitates meal planning and encourages cooking at home by suggesting recipes matching available ingredients.</w:t>
       </w:r>
     </w:p>
     <w:p>
       <w:pPr>
-        <w:pStyle w:val="Heading2"/>
+        <w:pStyle w:val="ListBullet"/>
+        <w:spacing w:after="40"/>
       </w:pPr>
       <w:r>
-        <w:t>Definition</w:t>
+        <w:rPr>
+          <w:rFonts w:ascii="Times New Roman" w:hAnsi="Times New Roman"/>
+        </w:rPr>
+        <w:t>Reduces food waste by identifying recipes that consume ingredients nearing expiration.</w:t>
       </w:r>
     </w:p>
     <w:p>
+      <w:pPr>
+        <w:pStyle w:val="ListBullet"/>
+        <w:spacing w:after="40"/>
+      </w:pPr>
       <w:r>
-        <w:t>Food recommendation is a specialized domain within recommender systems that introduces unique challenges absent from standard movie or product recommendation. These challenges stem from the multi-objective nature of food choices, where user satisfaction depends simultaneously on taste preference, nutritional health, preparation constraints, ingredient availability, cultural context, and dietary restrictions.</w:t>
-        <w:br/>
-        <w:br/>
-        <w:t>Key distinctions from general recommendation:</w:t>
-        <w:br/>
-        <w:t>1. Multi-objective optimization: A good food recommendation must balance preference accuracy with health objectives, preparation time, and ingredient diversity — unlike movie recommendation where only preference accuracy matters.</w:t>
-        <w:br/>
-        <w:t>2. Nutritional constraints: Food items carry quantifiable health properties (calories, macronutrients, micronutrients) that must be factored into ranking decisions.</w:t>
-        <w:br/>
-        <w:t>3. Ingredient-level reasoning: Recipes are composed of ingredients with complex compatibility relationships (flavor pairing, allergen co-occurrence).</w:t>
-        <w:br/>
-        <w:t>4. Temporal consumption patterns: Food preferences vary by time of day, season, and weekday vs. weekend.</w:t>
-        <w:br/>
-        <w:t>5. Cultural and dietary context: Religious, ethical (vegetarian/vegan), and medical (diabetes, hypertension) constraints add hard filtering requirements.</w:t>
-        <w:br/>
-        <w:t>6. Recipe structure: Unlike atomic items (movies, products), recipes are hierarchical objects with title, ingredients, steps, and nutrition that require structured NLP processing.</w:t>
+        <w:rPr>
+          <w:rFonts w:ascii="Times New Roman" w:hAnsi="Times New Roman"/>
+        </w:rPr>
+        <w:t>Increases recipe discovery by introducing users to foreign cuisines matching their flavor history.</w:t>
       </w:r>
     </w:p>
     <w:p>
       <w:pPr>
         <w:pStyle w:val="Heading2"/>
+        <w:keepNext/>
+        <w:spacing w:before="240" w:after="80"/>
       </w:pPr>
       <w:r>
-        <w:t>Core Working Principle</w:t>
+        <w:rPr>
+          <w:rFonts w:ascii="Times New Roman" w:hAnsi="Times New Roman"/>
+          <w:b/>
+          <w:color w:val="000000"/>
+          <w:sz w:val="24"/>
+        </w:rPr>
+        <w:t>2.5 Disadvantages</w:t>
       </w:r>
     </w:p>
     <w:p>
+      <w:pPr>
+        <w:pStyle w:val="ListBullet"/>
+        <w:spacing w:after="40"/>
+      </w:pPr>
       <w:r>
-        <w:t>Food recommendation requires modeling at multiple levels simultaneously. At the interaction level, collaborative filtering captures user-recipe preference patterns. At the content level, ingredient lists, tags, and nutritional profiles enable similarity computation and constraint filtering. At the temporal level, user interaction sequences reveal meal planning patterns. The multi-objective ranking formula proposed in GroundedNutriRec captures this:</w:t>
-        <w:br/>
-        <w:br/>
-        <w:t xml:space="preserve">  FinalScore = alpha1 * PreferenceScore + alpha2 * HealthScore + alpha3 * PopularityScore + alpha4 * DiversityScore + alpha5 * PreparationTimeScore</w:t>
-        <w:br/>
-        <w:br/>
-        <w:t>Each alpha is a tunable weight that can be personalized per user or set globally through ablation studies.</w:t>
+        <w:rPr>
+          <w:rFonts w:ascii="Times New Roman" w:hAnsi="Times New Roman"/>
+        </w:rPr>
+        <w:t>High model complexity due to the need to parse structured text, raw instruction lists, and nutritional vectors.</w:t>
       </w:r>
     </w:p>
     <w:p>
       <w:pPr>
-        <w:pStyle w:val="Heading2"/>
+        <w:pStyle w:val="ListBullet"/>
+        <w:spacing w:after="40"/>
       </w:pPr>
       <w:r>
-        <w:t>Relevance to GroundedNutriRec</w:t>
+        <w:rPr>
+          <w:rFonts w:ascii="Times New Roman" w:hAnsi="Times New Roman"/>
+        </w:rPr>
+        <w:t>Interaction data is highly sparse because users cook only a fraction of cataloged recipes.</w:t>
       </w:r>
     </w:p>
     <w:p>
+      <w:pPr>
+        <w:pStyle w:val="ListBullet"/>
+        <w:spacing w:after="40"/>
+      </w:pPr>
       <w:r>
-        <w:t>The Food.com dataset used in this project contains 231,637 recipes with detailed nutritional information (7-element PDV vectors), ingredient lists, preparation steps, and user interaction histories spanning 18 years. This richness makes it ideal for building the multi-objective ranking pipeline. The GroundedNutriRec framework addresses the limitations of existing food recommenders by combining preference-based ranking with explicit health scoring, RAG-based explainability, and faithfulness verification — all evaluated against this dataset.</w:t>
+        <w:rPr>
+          <w:rFonts w:ascii="Times New Roman" w:hAnsi="Times New Roman"/>
+        </w:rPr>
+        <w:t>Traditional offline evaluation metrics (Precision, Recall) do not capture physical variables like ingredient availability or preparation difficulty.</w:t>
       </w:r>
     </w:p>
     <w:p>
       <w:pPr>
         <w:pStyle w:val="Heading2"/>
+        <w:keepNext/>
+        <w:spacing w:before="240" w:after="80"/>
       </w:pPr>
       <w:r>
-        <w:t>Formula / Concrete Example</w:t>
+        <w:rPr>
+          <w:rFonts w:ascii="Times New Roman" w:hAnsi="Times New Roman"/>
+          <w:b/>
+          <w:color w:val="000000"/>
+          <w:sz w:val="24"/>
+        </w:rPr>
+        <w:t>2.6 Use Cases</w:t>
       </w:r>
     </w:p>
     <w:p>
+      <w:pPr>
+        <w:pStyle w:val="ListBullet"/>
+        <w:spacing w:after="40"/>
+      </w:pPr>
       <w:r>
-        <w:t>Example multi-objective ranking scenario:</w:t>
-        <w:br/>
-        <w:t xml:space="preserve">  User requests: high-protein, quick recipes</w:t>
-        <w:br/>
-        <w:t xml:space="preserve">  Candidate recipes evaluated on 5 dimensions:</w:t>
-        <w:br/>
-        <w:t xml:space="preserve">    Recipe A: Preference=0.8, Health=0.9, Popularity=0.6, Diversity=0.5, PrepTime=0.7</w:t>
-        <w:br/>
-        <w:t xml:space="preserve">    Recipe B: Preference=0.9, Health=0.3, Popularity=0.8, Diversity=0.4, PrepTime=0.5</w:t>
-        <w:br/>
-        <w:t xml:space="preserve">  With weights alpha = [0.3, 0.3, 0.1, 0.1, 0.2]:</w:t>
-        <w:br/>
-        <w:t xml:space="preserve">    Score_A = 0.3*0.8 + 0.3*0.9 + 0.1*0.6 + 0.1*0.5 + 0.2*0.7 = 0.24 + 0.27 + 0.06 + 0.05 + 0.14 = 0.76</w:t>
-        <w:br/>
-        <w:t xml:space="preserve">    Score_B = 0.3*0.9 + 0.3*0.3 + 0.1*0.8 + 0.1*0.4 + 0.2*0.5 = 0.27 + 0.09 + 0.08 + 0.04 + 0.10 = 0.58</w:t>
-        <w:br/>
-        <w:t xml:space="preserve">  Recipe A ranks higher because health and prep-time scores dominate under these weights.</w:t>
-      </w:r>
-    </w:p>
-    <w:p/>
-    <w:p>
-      <w:pPr>
-        <w:pStyle w:val="Heading1"/>
-      </w:pPr>
-      <w:r>
-        <w:t>4. Health-Aware Recommendation</w:t>
+        <w:rPr>
+          <w:rFonts w:ascii="Times New Roman" w:hAnsi="Times New Roman"/>
+        </w:rPr>
+        <w:t>Recipe indexing websites providing personalized search and meal matching.</w:t>
       </w:r>
     </w:p>
     <w:p>
       <w:pPr>
-        <w:pStyle w:val="Heading2"/>
+        <w:pStyle w:val="ListBullet"/>
+        <w:spacing w:after="40"/>
       </w:pPr>
       <w:r>
-        <w:t>Definition</w:t>
+        <w:rPr>
+          <w:rFonts w:ascii="Times New Roman" w:hAnsi="Times New Roman"/>
+        </w:rPr>
+        <w:t>Smart refrigerator interfaces suggesting dishes based on inventory tracking.</w:t>
       </w:r>
     </w:p>
     <w:p>
+      <w:pPr>
+        <w:pStyle w:val="ListBullet"/>
+        <w:spacing w:after="40"/>
+      </w:pPr>
       <w:r>
-        <w:t>Health-aware recommendation systems augment traditional preference-based ranking with nutritional quality assessment. They ensure that recommended food items satisfy dietary guidelines and health constraints in addition to matching user taste preferences. The health dimension transforms food recommendation from a single-objective optimization (maximize preference accuracy) into a multi-objective optimization (maximize preference while constraining or maximizing nutritional quality).</w:t>
-        <w:br/>
-        <w:br/>
-        <w:t>Key components:</w:t>
-        <w:br/>
-        <w:t>1. PDV (Percent Daily Value) interpretation: The Food.com nutrition column encodes nutritional content as PDV percentages for total fat, sugar, sodium, protein, saturated fat, and carbohydrates. A PDV of 20% or more for a single nutrient is considered high; 5% or less is considered low (FDA guidance).</w:t>
-        <w:br/>
-        <w:t>2. Health score construction: A composite health score is derived from the normalized nutritional vector. High protein and fiber are rewarded; high sugar, sodium, and saturated fat are penalized.</w:t>
-        <w:br/>
-        <w:t>3. Dietary compliance: Hard constraints (allergen filtering, calorie caps) are applied before ranking; soft constraints (macronutrient balance) are incorporated into the scoring function.</w:t>
+        <w:rPr>
+          <w:rFonts w:ascii="Times New Roman" w:hAnsi="Times New Roman"/>
+        </w:rPr>
+        <w:t>Grocery delivery platforms recommending meal kits and automated shopping lists.</w:t>
       </w:r>
     </w:p>
     <w:p>
       <w:pPr>
         <w:pStyle w:val="Heading2"/>
+        <w:keepNext/>
+        <w:spacing w:before="240" w:after="80"/>
       </w:pPr>
       <w:r>
-        <w:t>Core Working Principle</w:t>
+        <w:rPr>
+          <w:rFonts w:ascii="Times New Roman" w:hAnsi="Times New Roman"/>
+          <w:b/>
+          <w:color w:val="000000"/>
+          <w:sz w:val="24"/>
+        </w:rPr>
+        <w:t>2.7 Limitations</w:t>
       </w:r>
     </w:p>
     <w:p>
+      <w:pPr>
+        <w:pStyle w:val="ListBullet"/>
+        <w:spacing w:after="40"/>
+      </w:pPr>
       <w:r>
-        <w:t>The health score in GroundedNutriRec is constructed from the 7-element nutrition vector: [calories, total_fat_pdv, sugar_pdv, sodium_pdv, protein_pdv, saturated_fat_pdv, carbohydrates_pdv]. The score rewards recipes with higher protein_pdv and lower sugar_pdv, sodium_pdv, and saturated_fat_pdv. A simple linear health score formulation:</w:t>
-        <w:br/>
-        <w:br/>
-        <w:t xml:space="preserve">  HealthScore = w1 * normalize(protein_pdv) - w2 * normalize(sugar_pdv) - w3 * normalize(sodium_pdv) - w4 * normalize(saturated_fat_pdv) - w5 * normalize(calories)</w:t>
-        <w:br/>
-        <w:br/>
-        <w:t>Normalization maps each nutrient value to [0, 1] using min-max scaling across the entire recipe corpus. Weights w1 through w5 are determined through ablation studies in Week 4.</w:t>
+        <w:rPr>
+          <w:rFonts w:ascii="Times New Roman" w:hAnsi="Times New Roman"/>
+        </w:rPr>
+        <w:t>Cannot verify if the user possesses the necessary kitchen tools or cooking skills required for a recipe.</w:t>
       </w:r>
     </w:p>
     <w:p>
       <w:pPr>
-        <w:pStyle w:val="Heading2"/>
+        <w:pStyle w:val="ListBullet"/>
+        <w:spacing w:after="40"/>
       </w:pPr>
       <w:r>
-        <w:t>Relevance to GroundedNutriRec</w:t>
+        <w:rPr>
+          <w:rFonts w:ascii="Times New Roman" w:hAnsi="Times New Roman"/>
+        </w:rPr>
+        <w:t>Struggles to model individual sensory taste preferences (e.g., subjective liking of spices).</w:t>
       </w:r>
     </w:p>
     <w:p>
+      <w:pPr>
+        <w:pStyle w:val="ListBullet"/>
+        <w:spacing w:after="40"/>
+      </w:pPr>
       <w:r>
-        <w:t>Health scoring is the central research contribution that differentiates GroundedNutriRec from standard food recommenders. The 7-element nutrition vector in RAW_recipes.csv provides the raw input for health score computation. In Week 4, the health score will be integrated into the multi-objective ranking function alongside preference, popularity, diversity, and preparation time scores.</w:t>
+        <w:rPr>
+          <w:rFonts w:ascii="Times New Roman" w:hAnsi="Times New Roman"/>
+        </w:rPr>
+        <w:t>Incapable of dynamically checking local ingredient fresh/expired states without external sensors.</w:t>
       </w:r>
     </w:p>
-    <w:p>
-      <w:pPr>
-        <w:pStyle w:val="Heading2"/>
-      </w:pPr>
-      <w:r>
-        <w:t>Formula / Concrete Example</w:t>
-      </w:r>
-    </w:p>
-    <w:p>
-      <w:r>
-        <w:t>Concrete health score calculation:</w:t>
-        <w:br/>
-        <w:t xml:space="preserve">  Recipe: 'Grilled Chicken Salad'</w:t>
-        <w:br/>
-        <w:t xml:space="preserve">  Nutrition = [calories=250, total_fat_pdv=12, sugar_pdv=3, sodium_pdv=8, protein_pdv=45, sat_fat_pdv=5, carbs_pdv=10]</w:t>
-        <w:br/>
-        <w:br/>
-        <w:t xml:space="preserve">  Normalized values (assuming corpus min-max): protein=0.82, sugar=0.05, sodium=0.12, sat_fat=0.08, calories=0.15</w:t>
-        <w:br/>
-        <w:t xml:space="preserve">  HealthScore = 0.4*0.82 - 0.2*0.05 - 0.2*0.12 - 0.1*0.08 - 0.1*0.15</w:t>
-        <w:br/>
-        <w:t xml:space="preserve">             = 0.328 - 0.010 - 0.024 - 0.008 - 0.015 = 0.271</w:t>
-        <w:br/>
-        <w:br/>
-        <w:t xml:space="preserve">  A higher score indicates a healthier recipe relative to the corpus.</w:t>
-      </w:r>
-    </w:p>
-    <w:p/>
-    <w:p>
-      <w:pPr>
-        <w:pStyle w:val="Heading1"/>
-      </w:pPr>
-      <w:r>
-        <w:t>5. Explainable AI in Recommendation</w:t>
-      </w:r>
-    </w:p>
-    <w:p>
-      <w:pPr>
-        <w:pStyle w:val="Heading2"/>
-      </w:pPr>
-      <w:r>
-        <w:t>Definition</w:t>
-      </w:r>
-    </w:p>
-    <w:p>
-      <w:r>
-        <w:t>Explainable AI (XAI) in recommendation systems provides transparent reasoning behind suggestions, enabling users to understand why a particular item was recommended. In health-sensitive domains like food recommendation, explainability is not optional — users must understand the nutritional rationale behind recommendations to make informed dietary decisions.</w:t>
-        <w:br/>
-        <w:br/>
-        <w:t>Two paradigms exist:</w:t>
-        <w:br/>
-        <w:t>1. Post-hoc explainability: The recommendation model operates as a black box, and a separate explanation module generates justifications after the recommendation is produced. Examples include attention-weight visualization, LIME/SHAP feature attribution, and template-based natural language explanations.</w:t>
-        <w:br/>
-        <w:t>2. Intrinsic explainability: The model architecture itself is designed to produce explanations as a byproduct of its reasoning process. Examples include knowledge-graph-based recommenders where the reasoning path is inherently interpretable.</w:t>
-        <w:br/>
-        <w:br/>
-        <w:t>Why black-box models fail in food/health domains:</w:t>
-        <w:br/>
-        <w:t>- A user with diabetes needs to know the sugar content reasoning, not just a confidence score.</w:t>
-        <w:br/>
-        <w:t>- Allergen-related recommendations require verifiable ingredient-level justification.</w:t>
-        <w:br/>
-        <w:t>- Regulatory compliance in clinical dietary systems demands auditable explanation trails.</w:t>
-      </w:r>
-    </w:p>
-    <w:p>
-      <w:pPr>
-        <w:pStyle w:val="Heading2"/>
-      </w:pPr>
-      <w:r>
-        <w:t>Core Working Principle</w:t>
-      </w:r>
-    </w:p>
-    <w:p>
-      <w:r>
-        <w:t>GroundedNutriRec uses a post-hoc RAG-based explanation approach. After the multi-objective ranking module selects the top-K recipes, the explanation module retrieves the nutritional evidence and recipe metadata from a vector store, injects this evidence into the LLM prompt context, and instructs the LLM to generate explanations grounded exclusively in the retrieved evidence. The critical constraint is faithfulness: every claim in the explanation must be supported by the retrieved documents.</w:t>
-        <w:br/>
-        <w:br/>
-        <w:t>The explanation pipeline:</w:t>
-        <w:br/>
-        <w:t>1. User selects a health-aware preference (e.g., 'high protein, low sodium')</w:t>
-        <w:br/>
-        <w:t>2. Multi-objective ranker produces top-K recipes</w:t>
-        <w:br/>
-        <w:t>3. For each recipe, the RAG module retrieves its nutritional profile and ingredient list from the vector store</w:t>
-        <w:br/>
-        <w:t>4. The LLM generates a natural language explanation constrained to the retrieved context</w:t>
-        <w:br/>
-        <w:t>5. The faithfulness verifier checks every claim against the evidence</w:t>
-      </w:r>
-    </w:p>
-    <w:p>
-      <w:pPr>
-        <w:pStyle w:val="Heading2"/>
-      </w:pPr>
-      <w:r>
-        <w:t>Relevance to GroundedNutriRec</w:t>
-      </w:r>
-    </w:p>
-    <w:p>
-      <w:r>
-        <w:t>Explainability is the third pillar of the GroundedNutriRec framework (alongside preference accuracy and health awareness). The RAG explanation module in Week 5 will generate grounded justifications for each recommended recipe, and the claim-level faithfulness verifier will quantify hallucination rates. This directly addresses the research gap: no existing food recommendation system combines multi-objective ranking with RAG-grounded explanations and faithfulness verification.</w:t>
-      </w:r>
-    </w:p>
-    <w:p>
-      <w:pPr>
-        <w:pStyle w:val="Heading2"/>
-      </w:pPr>
-      <w:r>
-        <w:t>Formula / Concrete Example</w:t>
-      </w:r>
-    </w:p>
-    <w:p>
-      <w:r>
-        <w:t>Example explanation:</w:t>
-        <w:br/>
-        <w:t xml:space="preserve">  Recommended recipe: 'Bourbon Chicken'</w:t>
-        <w:br/>
-        <w:t xml:space="preserve">  Retrieved evidence: protein_pdv=35%, calories=380, sodium_pdv=22%, prep_time=45min</w:t>
-        <w:br/>
-        <w:br/>
-        <w:t xml:space="preserve">  Generated explanation: 'Bourbon Chicken is recommended because it provides 35% of your daily protein needs with moderate calories (380 per serving). However, note that sodium content is at 22% PDV, which is above the low-sodium threshold. Preparation time is 45 minutes, fitting your weeknight cooking constraint.'</w:t>
-        <w:br/>
-        <w:br/>
-        <w:t xml:space="preserve">  Every claim (35% protein, 380 calories, 22% sodium, 45 minutes) is directly verifiable against the retrieved evidence.</w:t>
-      </w:r>
-    </w:p>
-    <w:p/>
-    <w:p>
-      <w:pPr>
-        <w:pStyle w:val="Heading1"/>
-      </w:pPr>
-      <w:r>
-        <w:t>6. Large Language Models (LLMs)</w:t>
-      </w:r>
-    </w:p>
-    <w:p>
-      <w:pPr>
-        <w:pStyle w:val="Heading2"/>
-      </w:pPr>
-      <w:r>
-        <w:t>Definition</w:t>
-      </w:r>
-    </w:p>
-    <w:p>
-      <w:r>
-        <w:t>Large Language Models are deep neural networks based on the Transformer architecture that are pre-trained on massive text corpora to learn general language representations and then fine-tuned or prompted for specific tasks. Modern LLMs (GPT-4, Claude, Gemini, LLaMA) contain billions of parameters and demonstrate emergent capabilities in reasoning, summarization, and generation.</w:t>
-        <w:br/>
-        <w:br/>
-        <w:t>Key architectural components of the Transformer:</w:t>
-        <w:br/>
-        <w:t>1. Self-Attention Mechanism: Computes attention weights between all pairs of tokens in the input sequence, allowing each token to attend to every other token. The attention function is:</w:t>
-        <w:br/>
-        <w:t xml:space="preserve">   Attention(Q, K, V) = softmax(Q * K^T / sqrt(d_k)) * V</w:t>
-        <w:br/>
-        <w:t xml:space="preserve">   where Q (query), K (key), V (value) are linear projections of the input embeddings, and d_k is the dimension of the key vectors.</w:t>
-        <w:br/>
-        <w:t>2. Multi-Head Attention: Runs multiple attention functions in parallel, each learning different aspects of token relationships.</w:t>
-        <w:br/>
-        <w:t>3. Positional Encoding: Since self-attention is position-invariant, positional encodings are added to input embeddings to inject sequence order information.</w:t>
-        <w:br/>
-        <w:t>4. Feed-Forward Networks: Each transformer layer includes a position-wise feed-forward network that applies non-linear transformations to the attention output.</w:t>
-        <w:br/>
-        <w:t>5. Layer Normalization and Residual Connections: Stabilize training of deep transformer stacks.</w:t>
-      </w:r>
-    </w:p>
-    <w:p>
-      <w:pPr>
-        <w:pStyle w:val="Heading2"/>
-      </w:pPr>
-      <w:r>
-        <w:t>Core Working Principle</w:t>
-      </w:r>
-    </w:p>
-    <w:p>
-      <w:r>
-        <w:t>Pre-training vs Fine-tuning:</w:t>
-        <w:br/>
-        <w:br/>
-        <w:t>Pre-training: The model is trained on a massive unlabeled corpus (e.g., Common Crawl, Wikipedia) using self-supervised objectives such as next-token prediction (autoregressive LMs like GPT) or masked token prediction (masked LMs like BERT). This stage teaches general language understanding, factual knowledge, and reasoning patterns.</w:t>
-        <w:br/>
-        <w:br/>
-        <w:t>Fine-tuning: The pre-trained model is adapted to a specific downstream task using a smaller labeled dataset. Methods include full fine-tuning (updating all parameters), parameter-efficient fine-tuning (LoRA, adapters), and instruction tuning (training on instruction-response pairs).</w:t>
-        <w:br/>
-        <w:br/>
-        <w:t>Prompting (In-Context Learning): Instead of fine-tuning, the model is given task instructions and examples directly in the input prompt. This is the approach used in GroundedNutriRec's RAG module, where the LLM is prompted with retrieved recipe evidence and instructed to generate grounded explanations.</w:t>
-      </w:r>
-    </w:p>
-    <w:p>
-      <w:pPr>
-        <w:pStyle w:val="Heading2"/>
-      </w:pPr>
-      <w:r>
-        <w:t>Relevance to GroundedNutriRec</w:t>
-      </w:r>
-    </w:p>
-    <w:p>
-      <w:r>
-        <w:t>In GroundedNutriRec, LLMs serve as the explanation generation engine. The RAG pipeline retrieves recipe evidence from the vector store and constructs a structured prompt that constrains the LLM to generate explanations based only on the provided context. The LLM is not fine-tuned; instead, it is used via in-context learning with carefully designed system prompts that enforce faithfulness to retrieved evidence.</w:t>
-      </w:r>
-    </w:p>
-    <w:p>
-      <w:pPr>
-        <w:pStyle w:val="Heading2"/>
-      </w:pPr>
-      <w:r>
-        <w:t>Formula / Concrete Example</w:t>
-      </w:r>
-    </w:p>
-    <w:p>
-      <w:r>
-        <w:t>Attention computation example:</w:t>
-        <w:br/>
-        <w:t xml:space="preserve">  Input tokens: ['high', 'protein', 'chicken', 'recipe']</w:t>
-        <w:br/>
-        <w:t xml:space="preserve">  Each token is projected into Q, K, V vectors of dimension d_k=64</w:t>
-        <w:br/>
-        <w:t xml:space="preserve">  Attention weight between 'protein' and 'chicken' would be high because these tokens co-occur frequently in nutritional cooking contexts</w:t>
-        <w:br/>
-        <w:t xml:space="preserve">  The softmax normalizes weights so they sum to 1 across all key positions</w:t>
-        <w:br/>
-        <w:t xml:space="preserve">  Result: 'protein' attends strongly to 'chicken' and 'high', producing a context-enriched representation</w:t>
-      </w:r>
-    </w:p>
-    <w:p/>
-    <w:p>
-      <w:pPr>
-        <w:pStyle w:val="Heading1"/>
-      </w:pPr>
-      <w:r>
-        <w:t>7. Retrieval-Augmented Generation (RAG)</w:t>
-      </w:r>
-    </w:p>
-    <w:p>
-      <w:pPr>
-        <w:pStyle w:val="Heading2"/>
-      </w:pPr>
-      <w:r>
-        <w:t>Definition</w:t>
-      </w:r>
-    </w:p>
-    <w:p>
-      <w:r>
-        <w:t>Retrieval-Augmented Generation is a framework that enhances LLM outputs by grounding them in externally retrieved documents before generation. Instead of relying solely on the model's parametric memory (which can be outdated or hallucinated), RAG injects verified factual context into the generation prompt, dramatically reducing fabrication.</w:t>
-        <w:br/>
-        <w:br/>
-        <w:t>The RAG pipeline consists of three phases:</w:t>
-        <w:br/>
-        <w:t>1. Indexing: Documents (e.g., recipe profiles, nutritional summaries) are converted into dense vector embeddings using a sentence transformer model (e.g., all-MiniLM-L6-v2) and stored in a vector database (FAISS, ChromaDB, or Qdrant).</w:t>
-        <w:br/>
-        <w:t>2. Retrieval: Given a user query (e.g., 'Why is this recipe healthy?'), the query is embedded into the same vector space, and the top-K most semantically similar documents are retrieved using approximate nearest neighbor search.</w:t>
-        <w:br/>
-        <w:t>3. Generation: The retrieved documents are concatenated with the user query into a structured prompt. The LLM generates its response constrained to the information in the retrieved context.</w:t>
-      </w:r>
-    </w:p>
-    <w:p>
-      <w:pPr>
-        <w:pStyle w:val="Heading2"/>
-      </w:pPr>
-      <w:r>
-        <w:t>Core Working Principle</w:t>
-      </w:r>
-    </w:p>
-    <w:p>
-      <w:r>
-        <w:t>RAG reduces hallucination because the LLM's generation is anchored to specific, verifiable evidence rather than relying on parametric recall. The key insight is that LLMs are excellent at synthesizing and formatting information presented in their context window, but unreliable at recalling specific facts from their training data. By providing the exact nutritional values and ingredient lists in the prompt context, the LLM can generate accurate, verifiable explanations.</w:t>
-        <w:br/>
-        <w:br/>
-        <w:t>Embedding models play a critical role in retrieval quality. The sentence transformer must map semantically similar queries and documents to nearby points in the vector space. For food recommendation, this means queries like 'low fat high protein recipe' should retrieve documents containing recipes with low fat and high protein values, even if those exact words do not appear in the document.</w:t>
-      </w:r>
-    </w:p>
-    <w:p>
-      <w:pPr>
-        <w:pStyle w:val="Heading2"/>
-      </w:pPr>
-      <w:r>
-        <w:t>Relevance to GroundedNutriRec</w:t>
-      </w:r>
-    </w:p>
-    <w:p>
-      <w:r>
-        <w:t>GroundedNutriRec's RAG module is built in Week 5. Each recipe in the Food.com dataset is converted into a knowledge-base document containing its name, ingredients, nutritional profile (7 decomposed values), preparation steps, and aggregated rating. These documents are indexed in a FAISS vector store. When the multi-objective ranker selects a recipe, the RAG module retrieves the recipe's evidence document and generates a natural language explanation. The faithfulness verifier then checks whether every claim in the explanation is supported by the retrieved evidence.</w:t>
-      </w:r>
-    </w:p>
-    <w:p>
-      <w:pPr>
-        <w:pStyle w:val="Heading2"/>
-      </w:pPr>
-      <w:r>
-        <w:t>Formula / Concrete Example</w:t>
-      </w:r>
-    </w:p>
-    <w:p>
-      <w:r>
-        <w:t>RAG pipeline example for food recommendation:</w:t>
-        <w:br/>
-        <w:t xml:space="preserve">  Query: 'Why is Grilled Chicken Salad recommended for my high-protein goal?'</w:t>
-        <w:br/>
-        <w:br/>
-        <w:t xml:space="preserve">  Step 1 - Retrieval: Embed query -&gt; search FAISS -&gt; retrieve document:</w:t>
-        <w:br/>
-        <w:t xml:space="preserve">    'Grilled Chicken Salad | Ingredients: chicken breast, mixed greens, olive oil, lemon | Nutrition: calories=250, protein_pdv=45%, fat_pdv=12%, sodium_pdv=8% | Rating: 4.5 | Prep: 20 min'</w:t>
-        <w:br/>
-        <w:br/>
-        <w:t xml:space="preserve">  Step 2 - Generation prompt:</w:t>
-        <w:br/>
-        <w:t xml:space="preserve">    'Based ONLY on the following evidence, explain why this recipe matches the user goal of high protein:</w:t>
-        <w:br/>
-        <w:t xml:space="preserve">    [retrieved document inserted here]</w:t>
-        <w:br/>
-        <w:t xml:space="preserve">    Do not include any information not present in the evidence.'</w:t>
-        <w:br/>
-        <w:br/>
-        <w:t xml:space="preserve">  Step 3 - LLM output:</w:t>
-        <w:br/>
-        <w:t xml:space="preserve">    'Grilled Chicken Salad provides 45% of your daily protein needs, making it an excellent high-protein choice. At 250 calories with only 12% daily fat, it offers a favorable protein-to-calorie ratio.'</w:t>
-      </w:r>
-    </w:p>
-    <w:p/>
-    <w:p>
-      <w:pPr>
-        <w:pStyle w:val="Heading1"/>
-      </w:pPr>
-      <w:r>
-        <w:t>8. Hallucination in LLMs</w:t>
-      </w:r>
-    </w:p>
-    <w:p>
-      <w:pPr>
-        <w:pStyle w:val="Heading2"/>
-      </w:pPr>
-      <w:r>
-        <w:t>Definition</w:t>
-      </w:r>
-    </w:p>
-    <w:p>
-      <w:r>
-        <w:t>Hallucination in LLMs refers to the generation of content that is fluent and plausible but factually incorrect, fabricated, or unsupported by the input context. In health-aware food recommendation, hallucinations are dangerous: an LLM might incorrectly claim a recipe is low-sodium when it contains 45% PDV sodium, potentially endangering users with hypertension.</w:t>
-        <w:br/>
-        <w:br/>
-        <w:t>Taxonomy of hallucinations:</w:t>
-        <w:br/>
-        <w:t>1. Intrinsic hallucination: The generated output contradicts the source document. Example: The evidence states protein_pdv=15% but the explanation claims 'this recipe is high in protein.'</w:t>
-        <w:br/>
-        <w:t>2. Extrinsic hallucination: The generated output contains information that cannot be verified from the source document — it is neither supported nor contradicted. Example: The explanation mentions 'this recipe pairs well with brown rice' when no pairing information exists in the evidence.</w:t>
-        <w:br/>
-        <w:br/>
-        <w:t>Both types are problematic in GroundedNutriRec. Intrinsic hallucinations directly mislead users about nutritional facts. Extrinsic hallucinations introduce unverifiable claims that undermine trust in the system.</w:t>
-      </w:r>
-    </w:p>
-    <w:p>
-      <w:pPr>
-        <w:pStyle w:val="Heading2"/>
-      </w:pPr>
-      <w:r>
-        <w:t>Core Working Principle</w:t>
-      </w:r>
-    </w:p>
-    <w:p>
-      <w:r>
-        <w:t>Faithfulness measurement is the quantitative approach to detecting and reporting hallucination rates. The GroundedNutriRec framework implements claim-level faithfulness verification:</w:t>
-        <w:br/>
-        <w:br/>
-        <w:t>1. Claim extraction: The generated explanation is decomposed into individual factual claims using an NLI (Natural Language Inference) model or rule-based parser.</w:t>
-        <w:br/>
-        <w:t>2. Claim verification: Each claim is compared against the retrieved evidence document to determine if it is supported (entailed), contradicted, or neutral (unverifiable).</w:t>
-        <w:br/>
-        <w:t>3. Metric computation:</w:t>
-        <w:br/>
-        <w:t xml:space="preserve">   Faithfulness Score = Supported Claims / Total Claims</w:t>
-        <w:br/>
-        <w:t xml:space="preserve">   Hallucination Rate = Unsupported Claims / Total Claims</w:t>
-        <w:br/>
-        <w:br/>
-        <w:t>These metrics are computed per explanation and averaged across the test set to produce system-level faithfulness statistics.</w:t>
-      </w:r>
-    </w:p>
-    <w:p>
-      <w:pPr>
-        <w:pStyle w:val="Heading2"/>
-      </w:pPr>
-      <w:r>
-        <w:t>Relevance to GroundedNutriRec</w:t>
-      </w:r>
-    </w:p>
-    <w:p>
-      <w:r>
-        <w:t>Hallucination measurement is the final evaluation layer in the GroundedNutriRec pipeline. After the RAG module generates explanations in Week 5, the faithfulness verifier in Weeks 5-6 decomposes each explanation into claims and checks them against the retrieved evidence. This produces the faithfulness score and hallucination rate that will appear in the research paper's evaluation tables. A high faithfulness score (&gt;0.9) demonstrates that RAG grounding effectively constrains the LLM.</w:t>
-      </w:r>
-    </w:p>
-    <w:p>
-      <w:pPr>
-        <w:pStyle w:val="Heading2"/>
-      </w:pPr>
-      <w:r>
-        <w:t>Formula / Concrete Example</w:t>
-      </w:r>
-    </w:p>
-    <w:p>
-      <w:r>
-        <w:t>Concrete claim-level verification example:</w:t>
-        <w:br/>
-        <w:t xml:space="preserve">  Generated explanation: 'This chicken recipe is high in protein (35% PDV), costs less than Rs. 80, is low in fat, and can be prepared quickly in 8 minutes.'</w:t>
-        <w:br/>
-        <w:br/>
-        <w:t xml:space="preserve">  Extracted claims and verification:</w:t>
-        <w:br/>
-        <w:t xml:space="preserve">    Claim 1: 'High in protein' | Evidence: protein_pdv=35% | Verdict: SUPPORTED</w:t>
-        <w:br/>
-        <w:t xml:space="preserve">    Claim 2: 'Costs less than Rs. 80' | Evidence: no price data | Verdict: UNSUPPORTED (extrinsic hallucination)</w:t>
-        <w:br/>
-        <w:t xml:space="preserve">    Claim 3: 'Low in fat' | Evidence: fat_pdv=28% | Verdict: CONTRADICTED (intrinsic hallucination — 28% is not low)</w:t>
-        <w:br/>
-        <w:t xml:space="preserve">    Claim 4: 'Prepared in 8 minutes' | Evidence: minutes=8 | Verdict: SUPPORTED</w:t>
-        <w:br/>
-        <w:br/>
-        <w:t xml:space="preserve">  Faithfulness Score = 2/4 = 0.50</w:t>
-        <w:br/>
-        <w:t xml:space="preserve">  Hallucination Rate = 2/4 = 0.50</w:t>
-      </w:r>
-    </w:p>
-    <w:p/>
-    <w:p>
-      <w:pPr>
-        <w:pStyle w:val="Heading1"/>
-      </w:pPr>
-      <w:r>
-        <w:t>9. Sequential Recommendation</w:t>
-      </w:r>
-    </w:p>
-    <w:p>
-      <w:pPr>
-        <w:pStyle w:val="Heading2"/>
-      </w:pPr>
-      <w:r>
-        <w:t>Definition</w:t>
-      </w:r>
-    </w:p>
-    <w:p>
-      <w:r>
-        <w:t>Sequential recommendation models the temporal ordering of user interactions to predict the next item a user will engage with. Unlike static collaborative filtering (which ignores interaction order), sequential models capture how user preferences evolve over time and how recent interactions influence future choices.</w:t>
-        <w:br/>
-        <w:br/>
-        <w:t>Core concept: User interaction sequences</w:t>
-        <w:br/>
-        <w:t>A user's interaction history is represented as an ordered sequence: S_u = [i_1, i_2, ..., i_t], where i_j is the item interacted with at time step j. The goal is to predict i_{t+1} given the sequence prefix [i_1, ..., i_t].</w:t>
-        <w:br/>
-        <w:br/>
-        <w:t>Three modeling approaches at increasing complexity:</w:t>
-        <w:br/>
-        <w:t>1. Markov Chain: Estimates transition probabilities P(i_{t+1} | i_t) from the interaction corpus. Only considers the last item — first-order Markov assumption. Simple and fast but cannot capture long-range dependencies.</w:t>
-        <w:br/>
-        <w:t>2. GRU4Rec (Gated Recurrent Unit for Recommendations): Uses a recurrent neural network with GRU cells to process the interaction sequence. The hidden state h_t captures a compressed representation of the entire sequence history up to time t. Predicts i_{t+1} by computing similarity between h_t and all candidate item embeddings.</w:t>
-        <w:br/>
-        <w:t>3. SASRec (Self-Attentive Sequential Recommendation): Uses the Transformer self-attention mechanism to model pairwise dependencies between all items in the sequence simultaneously. Unlike GRU4Rec, SASRec can directly attend to any past item regardless of distance, making it more effective at capturing long-range patterns.</w:t>
-      </w:r>
-    </w:p>
-    <w:p>
-      <w:pPr>
-        <w:pStyle w:val="Heading2"/>
-      </w:pPr>
-      <w:r>
-        <w:t>Core Working Principle</w:t>
-      </w:r>
-    </w:p>
-    <w:p>
-      <w:r>
-        <w:t>GRU4Rec processes the sequence one item at a time. At each step, the GRU cell updates its hidden state based on the current item embedding and the previous hidden state. The final hidden state summarizes the entire sequence and is used to score candidate items.</w:t>
-        <w:br/>
-        <w:br/>
-        <w:t>SASRec applies multi-head self-attention over the entire sequence at once. Each item embedding attends to all previous items (using a causal mask to prevent attending to future items). The output embedding at position t represents a context-aware summary of the user's preferences up to time t.</w:t>
-        <w:br/>
-        <w:br/>
-        <w:t>Both models are trained with a next-item prediction objective: given the sequence prefix, predict the next item. Evaluation uses the same top-K metrics (HitRate@10, NDCG@10, MRR@10).</w:t>
-      </w:r>
-    </w:p>
-    <w:p>
-      <w:pPr>
-        <w:pStyle w:val="Heading2"/>
-      </w:pPr>
-      <w:r>
-        <w:t>Relevance to GroundedNutriRec</w:t>
-      </w:r>
-    </w:p>
-    <w:p>
-      <w:r>
-        <w:t>Sequential recommendation is the advanced challenge for Student 1 in Week 6. The prerequisite is preparing timestamp-sorted interaction sequences from the RAW_interactions.csv file. The date column will be used to sort each user's interactions chronologically, creating input-target pairs like [Recipe_A, Recipe_B, Recipe_C] -&gt; Recipe_D. The sequential model adds a temporal behavior dimension to the recommender system that static CF models cannot capture.</w:t>
-      </w:r>
-    </w:p>
-    <w:p>
-      <w:pPr>
-        <w:pStyle w:val="Heading2"/>
-      </w:pPr>
-      <w:r>
-        <w:t>Formula / Concrete Example</w:t>
-      </w:r>
-    </w:p>
-    <w:p>
-      <w:r>
-        <w:t>Sequence creation example from Food.com data:</w:t>
-        <w:br/>
-        <w:t xml:space="preserve">  User 12345's interactions sorted by date:</w:t>
-        <w:br/>
-        <w:t xml:space="preserve">    2008-01-15: Recipe 2886 (Best Banana Bread)</w:t>
-        <w:br/>
-        <w:t xml:space="preserve">    2008-03-22: Recipe 45809 (Bourbon Chicken)</w:t>
-        <w:br/>
-        <w:t xml:space="preserve">    2008-07-10: Recipe 39087 (Creamy Cajun Chicken Pasta)</w:t>
-        <w:br/>
-        <w:t xml:space="preserve">    2008-11-05: Recipe 27208 (Crock Pot Roast)</w:t>
-        <w:br/>
-        <w:br/>
-        <w:t xml:space="preserve">  Training examples:</w:t>
-        <w:br/>
-        <w:t xml:space="preserve">    Input: [2886] -&gt; Target: 45809</w:t>
-        <w:br/>
-        <w:t xml:space="preserve">    Input: [2886, 45809] -&gt; Target: 39087</w:t>
-        <w:br/>
-        <w:t xml:space="preserve">    Input: [2886, 45809, 39087] -&gt; Target: 27208</w:t>
-      </w:r>
-    </w:p>
-    <w:p/>
-    <w:p>
-      <w:pPr>
-        <w:pStyle w:val="Heading1"/>
-      </w:pPr>
-      <w:r>
-        <w:t>10. Research Gap: What GroundedNutriRec Addresses</w:t>
-      </w:r>
-    </w:p>
-    <w:p>
-      <w:pPr>
-        <w:pStyle w:val="Heading2"/>
-      </w:pPr>
-      <w:r>
-        <w:t>Definition</w:t>
-      </w:r>
-    </w:p>
-    <w:p>
-      <w:r>
-        <w:t>Existing food recommendation systems address individual aspects of the recommendation challenge but fail to integrate them into a unified, end-to-end pipeline. The specific gaps identified in the literature:</w:t>
-        <w:br/>
-        <w:br/>
-        <w:t>Gap 1: Single-objective ranking — Most food recommenders optimize only for preference accuracy (collaborative filtering scores). They do not incorporate health objectives, preparation constraints, or diversity into the ranking function. Users receive recipes they might enjoy but that may be nutritionally poor.</w:t>
-        <w:br/>
-        <w:br/>
-        <w:t>Gap 2: Lack of explainability — Standard recommendation models (matrix factorization, neural CF) produce ranked lists without justification. Users cannot understand why a recipe was recommended or how it aligns with their health goals.</w:t>
-        <w:br/>
-        <w:br/>
-        <w:t>Gap 3: Ungrounded explanations — Systems that do generate explanations typically use template-based approaches or unconstrained LLM generation. Template-based explanations are rigid and uninformative. Unconstrained LLM explanations are fluent but prone to hallucination — fabricating nutritional claims or health benefits not supported by the recipe's actual data.</w:t>
-        <w:br/>
-        <w:br/>
-        <w:t>Gap 4: No faithfulness verification — No existing food recommendation system measures or controls the faithfulness of generated explanations. There is no quantitative guarantee that the explanations match the actual recipe data.</w:t>
-        <w:br/>
-        <w:br/>
-        <w:t>Gap 5: No temporal behavior modeling — Most food recommenders treat all interactions as a static set, ignoring the sequential patterns in user cooking behavior.</w:t>
-      </w:r>
-    </w:p>
-    <w:p>
-      <w:pPr>
-        <w:pStyle w:val="Heading2"/>
-      </w:pPr>
-      <w:r>
-        <w:t>Core Working Principle</w:t>
-      </w:r>
-    </w:p>
-    <w:p>
-      <w:r>
-        <w:t>GroundedNutriRec addresses all five gaps in a single integrated pipeline:</w:t>
-        <w:br/>
-        <w:br/>
-        <w:t>1. Multi-objective ranking: Combines preference score, health score, popularity, diversity, and preparation time into a weighted ranking function with ablation-tested weights and Pareto-front optimization.</w:t>
-        <w:br/>
-        <w:t>2. RAG-grounded explainability: Uses a retrieval-augmented LLM pipeline to generate explanations anchored in actual recipe evidence (nutritional profiles, ingredients, preparation data).</w:t>
-        <w:br/>
-        <w:t>3. Claim-level faithfulness verification: Decomposes generated explanations into individual claims and verifies each claim against the retrieved evidence, producing quantitative faithfulness scores.</w:t>
-        <w:br/>
-        <w:t>4. Sequential recommendation: Models temporal user behavior using GRU4Rec or SASRec to capture evolving food preferences.</w:t>
-        <w:br/>
-        <w:t>5. End-to-end integration: All components are connected in a pipeline from data loading through ranking, explanation, and verification — evaluated with standardized metrics.</w:t>
-      </w:r>
-    </w:p>
-    <w:p>
-      <w:pPr>
-        <w:pStyle w:val="Heading2"/>
-      </w:pPr>
-      <w:r>
-        <w:t>Relevance to GroundedNutriRec</w:t>
-      </w:r>
-    </w:p>
-    <w:p>
-      <w:r>
-        <w:t>This integrated approach is the core research contribution. The research paper will demonstrate that: (a) multi-objective ranking improves health outcomes without significantly sacrificing preference accuracy, (b) RAG grounding reduces hallucination rates compared to unconstrained LLM explanations, (c) claim-level verification provides a reliable faithfulness metric, and (d) sequential models capture temporal patterns that static models miss.</w:t>
-      </w:r>
-    </w:p>
-    <w:p>
-      <w:pPr>
-        <w:pStyle w:val="Heading2"/>
-      </w:pPr>
-      <w:r>
-        <w:t>Formula / Concrete Example</w:t>
-      </w:r>
-    </w:p>
-    <w:p>
-      <w:r>
-        <w:t>Research contribution positioning:</w:t>
-        <w:br/>
-        <w:t xml:space="preserve">  Existing System A: CF ranking + no explanation → High accuracy, no health awareness, no explainability</w:t>
-        <w:br/>
-        <w:t xml:space="preserve">  Existing System B: CF ranking + template explanation → Moderate accuracy, rigid explanations, no health scoring</w:t>
-        <w:br/>
-        <w:t xml:space="preserve">  Existing System C: CF ranking + LLM explanation → High accuracy, fluent explanations, high hallucination risk</w:t>
-        <w:br/>
-        <w:t xml:space="preserve">  GroundedNutriRec: Multi-objective ranking + RAG explanation + faithfulness verification → Balanced accuracy-health trade-off, grounded explanations, measured faithfulness</w:t>
-      </w:r>
-    </w:p>
-    <w:p/>
     <w:p>
       <w:r>
         <w:br w:type="page"/>
@@ -1141,74 +913,1932 @@
     <w:p>
       <w:pPr>
         <w:pStyle w:val="Heading1"/>
+        <w:keepNext/>
+        <w:spacing w:before="240" w:after="80"/>
       </w:pPr>
       <w:r>
-        <w:t>References</w:t>
+        <w:rPr>
+          <w:rFonts w:ascii="Times New Roman" w:hAnsi="Times New Roman"/>
+          <w:b/>
+          <w:color w:val="000000"/>
+          <w:sz w:val="26"/>
+        </w:rPr>
+        <w:t>3. Health-Aware Recommendation Systems</w:t>
+      </w:r>
+    </w:p>
+    <w:p>
+      <w:pPr>
+        <w:pStyle w:val="Heading2"/>
+        <w:keepNext/>
+        <w:spacing w:before="240" w:after="80"/>
+      </w:pPr>
+      <w:r>
+        <w:rPr>
+          <w:rFonts w:ascii="Times New Roman" w:hAnsi="Times New Roman"/>
+          <w:b/>
+          <w:color w:val="000000"/>
+          <w:sz w:val="24"/>
+        </w:rPr>
+        <w:t>3.1 Brief Introduction</w:t>
+      </w:r>
+    </w:p>
+    <w:p>
+      <w:pPr>
+        <w:spacing w:after="120" w:line="276" w:lineRule="auto"/>
+      </w:pPr>
+      <w:r>
+        <w:rPr>
+          <w:rFonts w:ascii="Times New Roman" w:hAnsi="Times New Roman"/>
+        </w:rPr>
+        <w:t>Health-aware recommendation systems integrate nutritional guidelines, physiological goals, and user health profiles to suggest foods that promote health. These models transition from pure preference matching to multi-objective optimization [Ge et al., 2015].</w:t>
+      </w:r>
+    </w:p>
+    <w:p>
+      <w:pPr>
+        <w:pStyle w:val="Heading2"/>
+        <w:keepNext/>
+        <w:spacing w:before="240" w:after="80"/>
+      </w:pPr>
+      <w:r>
+        <w:rPr>
+          <w:rFonts w:ascii="Times New Roman" w:hAnsi="Times New Roman"/>
+          <w:b/>
+          <w:color w:val="000000"/>
+          <w:sz w:val="24"/>
+        </w:rPr>
+        <w:t>3.2 Detailed Explanation</w:t>
+      </w:r>
+    </w:p>
+    <w:p>
+      <w:pPr>
+        <w:spacing w:after="120" w:line="276" w:lineRule="auto"/>
+      </w:pPr>
+      <w:r>
+        <w:rPr>
+          <w:rFonts w:ascii="Times New Roman" w:hAnsi="Times New Roman"/>
+        </w:rPr>
+        <w:t>Health-aware recommenders balance a user's predicted taste preferences with their nutritional requirements. Formally, this is modeled as a multi-objective optimization problem. The ranking score for a user-recipe pair $(u, i)$ is defined as:</w:t>
+      </w:r>
+    </w:p>
+    <w:p>
+      <w:pPr>
+        <w:spacing w:before="120" w:after="120"/>
+        <w:jc w:val="center"/>
+      </w:pPr>
+      <w:r>
+        <w:rPr>
+          <w:rFonts w:ascii="Times New Roman" w:hAnsi="Times New Roman"/>
+          <w:i/>
+          <w:sz w:val="22"/>
+        </w:rPr>
+        <w:t>\text{Utility}(u, i) = \alpha \cdot \text{Pref}(u, i) + (1 - \alpha) \cdot \text{Health}(i)</w:t>
+      </w:r>
+    </w:p>
+    <w:p>
+      <w:pPr>
+        <w:spacing w:after="120" w:line="276" w:lineRule="auto"/>
+      </w:pPr>
+      <w:r>
+        <w:rPr>
+          <w:rFonts w:ascii="Times New Roman" w:hAnsi="Times New Roman"/>
+        </w:rPr>
+        <w:t>where $\text{Pref}(u, i)$ is the personalized preference score, $\text{Health}(i)$ is the healthiness score of the recipe, and $\alpha \in [0, 1]$ is a trade-off parameter controlling the balance.</w:t>
+      </w:r>
+    </w:p>
+    <w:p>
+      <w:pPr>
+        <w:spacing w:after="120" w:line="276" w:lineRule="auto"/>
+      </w:pPr>
+      <w:r>
+        <w:rPr>
+          <w:rFonts w:ascii="Times New Roman" w:hAnsi="Times New Roman"/>
+        </w:rPr>
+        <w:t>The healthiness score $\text{Health}(i)$ is computed using established nutritional standards:</w:t>
+      </w:r>
+    </w:p>
+    <w:p>
+      <w:pPr>
+        <w:pStyle w:val="ListBullet"/>
+        <w:spacing w:after="40"/>
+      </w:pPr>
+      <w:r>
+        <w:rPr>
+          <w:rFonts w:ascii="Times New Roman" w:hAnsi="Times New Roman"/>
+        </w:rPr>
+        <w:t>**FSA/WHO Traffic Light System:** Evaluates the density of fat, saturated fat, sugar, and sodium per 100g, assigning red (high), amber (medium), or green (low) ratings. The score translates these ratings into penalties [WHO, 2003].</w:t>
+      </w:r>
+    </w:p>
+    <w:p>
+      <w:pPr>
+        <w:pStyle w:val="ListBullet"/>
+        <w:spacing w:after="40"/>
+      </w:pPr>
+      <w:r>
+        <w:rPr>
+          <w:rFonts w:ascii="Times New Roman" w:hAnsi="Times New Roman"/>
+        </w:rPr>
+        <w:t>**Macronutrient Alignment:** Measures the deviation of the recipe's protein, carbohydrate, and fat profile from the user's daily macronutrient targets (e.g., matching a $40\%$ protein, $30\%$ carb, $30\%$ fat target for fitness goals).</w:t>
+      </w:r>
+    </w:p>
+    <w:p>
+      <w:pPr>
+        <w:pStyle w:val="ListBullet"/>
+        <w:spacing w:after="40"/>
+      </w:pPr>
+      <w:r>
+        <w:rPr>
+          <w:rFonts w:ascii="Times New Roman" w:hAnsi="Times New Roman"/>
+        </w:rPr>
+        <w:t>**Dietary Constraints:** Hard constraints (allergies, diabetes, renal diets) act as filters. If a recipe contains an allergen or exceeds diabetic sugar thresholds, its utility is set to zero.</w:t>
+      </w:r>
+    </w:p>
+    <w:p>
+      <w:pPr>
+        <w:pStyle w:val="Heading2"/>
+        <w:keepNext/>
+        <w:spacing w:before="240" w:after="80"/>
+      </w:pPr>
+      <w:r>
+        <w:rPr>
+          <w:rFonts w:ascii="Times New Roman" w:hAnsi="Times New Roman"/>
+          <w:b/>
+          <w:color w:val="000000"/>
+          <w:sz w:val="24"/>
+        </w:rPr>
+        <w:t>3.3 Examples</w:t>
+      </w:r>
+    </w:p>
+    <w:p>
+      <w:pPr>
+        <w:pStyle w:val="ListBullet"/>
+        <w:spacing w:after="40"/>
+      </w:pPr>
+      <w:r>
+        <w:rPr>
+          <w:rFonts w:ascii="Times New Roman" w:hAnsi="Times New Roman"/>
+        </w:rPr>
+        <w:t>Suggesting a low-sodium, high-potassium recipe to a user with diagnosed hypertension while maintaining their preference for Mexican flavors.</w:t>
+      </w:r>
+    </w:p>
+    <w:p>
+      <w:pPr>
+        <w:pStyle w:val="ListBullet"/>
+        <w:spacing w:after="40"/>
+      </w:pPr>
+      <w:r>
+        <w:rPr>
+          <w:rFonts w:ascii="Times New Roman" w:hAnsi="Times New Roman"/>
+        </w:rPr>
+        <w:t>A fitness recommender suggesting post-workout protein-dense meals based on active physical training logs.</w:t>
+      </w:r>
+    </w:p>
+    <w:p>
+      <w:pPr>
+        <w:pStyle w:val="Heading2"/>
+        <w:keepNext/>
+        <w:spacing w:before="240" w:after="80"/>
+      </w:pPr>
+      <w:r>
+        <w:rPr>
+          <w:rFonts w:ascii="Times New Roman" w:hAnsi="Times New Roman"/>
+          <w:b/>
+          <w:color w:val="000000"/>
+          <w:sz w:val="24"/>
+        </w:rPr>
+        <w:t>3.4 Advantages</w:t>
+      </w:r>
+    </w:p>
+    <w:p>
+      <w:pPr>
+        <w:pStyle w:val="ListBullet"/>
+        <w:spacing w:after="40"/>
+      </w:pPr>
+      <w:r>
+        <w:rPr>
+          <w:rFonts w:ascii="Times New Roman" w:hAnsi="Times New Roman"/>
+        </w:rPr>
+        <w:t>Promotes public health by encouraging healthier dietary habits and helping manage chronic diet-related conditions (e.g., diabetes, obesity, cardiovascular diseases).</w:t>
+      </w:r>
+    </w:p>
+    <w:p>
+      <w:pPr>
+        <w:pStyle w:val="ListBullet"/>
+        <w:spacing w:after="40"/>
+      </w:pPr>
+      <w:r>
+        <w:rPr>
+          <w:rFonts w:ascii="Times New Roman" w:hAnsi="Times New Roman"/>
+        </w:rPr>
+        <w:t>Personalizes nutritional therapy by adapting clinical dietary plans to individual taste profiles, improving dietary adherence.</w:t>
+      </w:r>
+    </w:p>
+    <w:p>
+      <w:pPr>
+        <w:pStyle w:val="ListBullet"/>
+        <w:spacing w:after="40"/>
+      </w:pPr>
+      <w:r>
+        <w:rPr>
+          <w:rFonts w:ascii="Times New Roman" w:hAnsi="Times New Roman"/>
+        </w:rPr>
+        <w:t>Prevents adverse health events by filtering out allergens and contra-indicated ingredients.</w:t>
+      </w:r>
+    </w:p>
+    <w:p>
+      <w:pPr>
+        <w:pStyle w:val="Heading2"/>
+        <w:keepNext/>
+        <w:spacing w:before="240" w:after="80"/>
+      </w:pPr>
+      <w:r>
+        <w:rPr>
+          <w:rFonts w:ascii="Times New Roman" w:hAnsi="Times New Roman"/>
+          <w:b/>
+          <w:color w:val="000000"/>
+          <w:sz w:val="24"/>
+        </w:rPr>
+        <w:t>3.5 Disadvantages</w:t>
+      </w:r>
+    </w:p>
+    <w:p>
+      <w:pPr>
+        <w:pStyle w:val="ListBullet"/>
+        <w:spacing w:after="40"/>
+      </w:pPr>
+      <w:r>
+        <w:rPr>
+          <w:rFonts w:ascii="Times New Roman" w:hAnsi="Times New Roman"/>
+        </w:rPr>
+        <w:t>**Preference Conflict:** Healthy recipes often clash with users' high-sugar/high-fat taste preferences, causing lower user click-through rates.</w:t>
+      </w:r>
+    </w:p>
+    <w:p>
+      <w:pPr>
+        <w:pStyle w:val="ListBullet"/>
+        <w:spacing w:after="40"/>
+      </w:pPr>
+      <w:r>
+        <w:rPr>
+          <w:rFonts w:ascii="Times New Roman" w:hAnsi="Times New Roman"/>
+        </w:rPr>
+        <w:t>**Data Incompleteness:** Computing nutritional scores requires detailed, verified ingredient databases and accurate portions, which are often missing from user-contributed recipe portals.</w:t>
+      </w:r>
+    </w:p>
+    <w:p>
+      <w:pPr>
+        <w:pStyle w:val="ListBullet"/>
+        <w:spacing w:after="40"/>
+      </w:pPr>
+      <w:r>
+        <w:rPr>
+          <w:rFonts w:ascii="Times New Roman" w:hAnsi="Times New Roman"/>
+        </w:rPr>
+        <w:t>**Dynamic Needs:** User nutritional targets fluctuate based on health status, age, and activity, requiring continuous profile updating.</w:t>
+      </w:r>
+    </w:p>
+    <w:p>
+      <w:pPr>
+        <w:pStyle w:val="Heading2"/>
+        <w:keepNext/>
+        <w:spacing w:before="240" w:after="80"/>
+      </w:pPr>
+      <w:r>
+        <w:rPr>
+          <w:rFonts w:ascii="Times New Roman" w:hAnsi="Times New Roman"/>
+          <w:b/>
+          <w:color w:val="000000"/>
+          <w:sz w:val="24"/>
+        </w:rPr>
+        <w:t>3.6 Use Cases</w:t>
+      </w:r>
+    </w:p>
+    <w:p>
+      <w:pPr>
+        <w:pStyle w:val="ListBullet"/>
+        <w:spacing w:after="40"/>
+      </w:pPr>
+      <w:r>
+        <w:rPr>
+          <w:rFonts w:ascii="Times New Roman" w:hAnsi="Times New Roman"/>
+        </w:rPr>
+        <w:t>Dietary management apps integrated with electronic health records (EHR) to support patients post-discharge.</w:t>
+      </w:r>
+    </w:p>
+    <w:p>
+      <w:pPr>
+        <w:pStyle w:val="ListBullet"/>
+        <w:spacing w:after="40"/>
+      </w:pPr>
+      <w:r>
+        <w:rPr>
+          <w:rFonts w:ascii="Times New Roman" w:hAnsi="Times New Roman"/>
+        </w:rPr>
+        <w:t>Corporate wellness portals suggesting healthy cafeteria menus.</w:t>
+      </w:r>
+    </w:p>
+    <w:p>
+      <w:pPr>
+        <w:pStyle w:val="ListBullet"/>
+        <w:spacing w:after="40"/>
+      </w:pPr>
+      <w:r>
+        <w:rPr>
+          <w:rFonts w:ascii="Times New Roman" w:hAnsi="Times New Roman"/>
+        </w:rPr>
+        <w:t>Fitness trackers tailoring meal plans based on calorie expenditure metrics.</w:t>
+      </w:r>
+    </w:p>
+    <w:p>
+      <w:pPr>
+        <w:pStyle w:val="Heading2"/>
+        <w:keepNext/>
+        <w:spacing w:before="240" w:after="80"/>
+      </w:pPr>
+      <w:r>
+        <w:rPr>
+          <w:rFonts w:ascii="Times New Roman" w:hAnsi="Times New Roman"/>
+          <w:b/>
+          <w:color w:val="000000"/>
+          <w:sz w:val="24"/>
+        </w:rPr>
+        <w:t>3.7 Limitations</w:t>
+      </w:r>
+    </w:p>
+    <w:p>
+      <w:pPr>
+        <w:pStyle w:val="ListBullet"/>
+        <w:spacing w:after="40"/>
+      </w:pPr>
+      <w:r>
+        <w:rPr>
+          <w:rFonts w:ascii="Times New Roman" w:hAnsi="Times New Roman"/>
+        </w:rPr>
+        <w:t>Cannot substitute for clinical dieticians or address acute pathological dietary conditions.</w:t>
+      </w:r>
+    </w:p>
+    <w:p>
+      <w:pPr>
+        <w:pStyle w:val="ListBullet"/>
+        <w:spacing w:after="40"/>
+      </w:pPr>
+      <w:r>
+        <w:rPr>
+          <w:rFonts w:ascii="Times New Roman" w:hAnsi="Times New Roman"/>
+        </w:rPr>
+        <w:t>Cannot verify if the user adheres to the recommended recipes or accurately reports their consumption.</w:t>
+      </w:r>
+    </w:p>
+    <w:p>
+      <w:pPr>
+        <w:pStyle w:val="ListBullet"/>
+        <w:spacing w:after="40"/>
+      </w:pPr>
+      <w:r>
+        <w:rPr>
+          <w:rFonts w:ascii="Times New Roman" w:hAnsi="Times New Roman"/>
+        </w:rPr>
+        <w:t>Struggles when users present conflicting health objectives (e.g., a patient needing both a diabetic low-sugar diet and a renal low-potassium diet).</w:t>
       </w:r>
     </w:p>
     <w:p>
       <w:r>
-        <w:t>[1] Koren, Y., Bell, R., &amp; Volinsky, C. (2009). Matrix Factorization Techniques for Recommender Systems. IEEE Computer, 42(8), 30-37.</w:t>
+        <w:br w:type="page"/>
+      </w:r>
+    </w:p>
+    <w:p>
+      <w:pPr>
+        <w:pStyle w:val="Heading1"/>
+        <w:keepNext/>
+        <w:spacing w:before="240" w:after="80"/>
+      </w:pPr>
+      <w:r>
+        <w:rPr>
+          <w:rFonts w:ascii="Times New Roman" w:hAnsi="Times New Roman"/>
+          <w:b/>
+          <w:color w:val="000000"/>
+          <w:sz w:val="26"/>
+        </w:rPr>
+        <w:t>4. Explainable Recommendation Systems</w:t>
+      </w:r>
+    </w:p>
+    <w:p>
+      <w:pPr>
+        <w:pStyle w:val="Heading2"/>
+        <w:keepNext/>
+        <w:spacing w:before="240" w:after="80"/>
+      </w:pPr>
+      <w:r>
+        <w:rPr>
+          <w:rFonts w:ascii="Times New Roman" w:hAnsi="Times New Roman"/>
+          <w:b/>
+          <w:color w:val="000000"/>
+          <w:sz w:val="24"/>
+        </w:rPr>
+        <w:t>4.1 Brief Introduction</w:t>
+      </w:r>
+    </w:p>
+    <w:p>
+      <w:pPr>
+        <w:spacing w:after="120" w:line="276" w:lineRule="auto"/>
+      </w:pPr>
+      <w:r>
+        <w:rPr>
+          <w:rFonts w:ascii="Times New Roman" w:hAnsi="Times New Roman"/>
+        </w:rPr>
+        <w:t>Explainable recommendation systems provide natural language justifications or visual explanations alongside recommendations. This transparency helps users understand why a specific recommendation was generated, increasing trust and system transparency [Zhang and Chen, 2020].</w:t>
+      </w:r>
+    </w:p>
+    <w:p>
+      <w:pPr>
+        <w:pStyle w:val="Heading2"/>
+        <w:keepNext/>
+        <w:spacing w:before="240" w:after="80"/>
+      </w:pPr>
+      <w:r>
+        <w:rPr>
+          <w:rFonts w:ascii="Times New Roman" w:hAnsi="Times New Roman"/>
+          <w:b/>
+          <w:color w:val="000000"/>
+          <w:sz w:val="24"/>
+        </w:rPr>
+        <w:t>4.2 Detailed Explanation</w:t>
+      </w:r>
+    </w:p>
+    <w:p>
+      <w:pPr>
+        <w:spacing w:after="120" w:line="276" w:lineRule="auto"/>
+      </w:pPr>
+      <w:r>
+        <w:rPr>
+          <w:rFonts w:ascii="Times New Roman" w:hAnsi="Times New Roman"/>
+        </w:rPr>
+        <w:t>Explainability in recommenders shifts the system from a black-box model to a transparent decision-support tool. According to [Tintarev and Masthoff, 2011], explanations serve several distinct evaluation objectives:</w:t>
+      </w:r>
+    </w:p>
+    <w:p>
+      <w:pPr>
+        <w:spacing w:after="60"/>
+        <w:ind w:left="360"/>
+      </w:pPr>
+      <w:r>
+        <w:rPr>
+          <w:rFonts w:ascii="Times New Roman" w:hAnsi="Times New Roman"/>
+        </w:rPr>
+        <w:t>1. **Transparency:** Explaining how the system works to build user trust.</w:t>
+      </w:r>
+    </w:p>
+    <w:p>
+      <w:pPr>
+        <w:spacing w:after="60"/>
+        <w:ind w:left="360"/>
+      </w:pPr>
+      <w:r>
+        <w:rPr>
+          <w:rFonts w:ascii="Times New Roman" w:hAnsi="Times New Roman"/>
+        </w:rPr>
+        <w:t>2. **Scrutability:** Allowing users to correct incorrect assumptions made by the model.</w:t>
+      </w:r>
+    </w:p>
+    <w:p>
+      <w:pPr>
+        <w:spacing w:after="60"/>
+        <w:ind w:left="360"/>
+      </w:pPr>
+      <w:r>
+        <w:rPr>
+          <w:rFonts w:ascii="Times New Roman" w:hAnsi="Times New Roman"/>
+        </w:rPr>
+        <w:t>3. **Trust:** Increasing user confidence in the system's recommendations.</w:t>
+      </w:r>
+    </w:p>
+    <w:p>
+      <w:pPr>
+        <w:spacing w:after="60"/>
+        <w:ind w:left="360"/>
+      </w:pPr>
+      <w:r>
+        <w:rPr>
+          <w:rFonts w:ascii="Times New Roman" w:hAnsi="Times New Roman"/>
+        </w:rPr>
+        <w:t>4. **Persuasiveness:** Convincing the user to try the recommended item.</w:t>
+      </w:r>
+    </w:p>
+    <w:p>
+      <w:pPr>
+        <w:spacing w:after="60"/>
+        <w:ind w:left="360"/>
+      </w:pPr>
+      <w:r>
+        <w:rPr>
+          <w:rFonts w:ascii="Times New Roman" w:hAnsi="Times New Roman"/>
+        </w:rPr>
+        <w:t>5. **Efficiency:** Helping the user make decisions faster.</w:t>
+      </w:r>
+    </w:p>
+    <w:p>
+      <w:pPr>
+        <w:spacing w:after="60"/>
+        <w:ind w:left="360"/>
+      </w:pPr>
+      <w:r>
+        <w:rPr>
+          <w:rFonts w:ascii="Times New Roman" w:hAnsi="Times New Roman"/>
+        </w:rPr>
+        <w:t>6. **Satisfaction:** Enhancing the overall user experience.</w:t>
+      </w:r>
+    </w:p>
+    <w:p>
+      <w:pPr>
+        <w:spacing w:after="120" w:line="276" w:lineRule="auto"/>
+      </w:pPr>
+      <w:r>
+        <w:rPr>
+          <w:rFonts w:ascii="Times New Roman" w:hAnsi="Times New Roman"/>
+        </w:rPr>
+        <w:t>In the context of the GroundedNutriRec framework, explainable food recommendation bridges the gap between taste preferences and health objectives. For instance, if the system recommends a low-sodium dish to a hypertensive user, the explanation must explain the health benefits (e.g., "Recommended because it aligns with your low-sodium goal and contains ingredients you liked previously"). The generation is powered by Large Language Models (LLMs) instructed to produce structured natural language explanations.</w:t>
+      </w:r>
+    </w:p>
+    <w:p>
+      <w:pPr>
+        <w:pStyle w:val="Heading2"/>
+        <w:keepNext/>
+        <w:spacing w:before="240" w:after="80"/>
+      </w:pPr>
+      <w:r>
+        <w:rPr>
+          <w:rFonts w:ascii="Times New Roman" w:hAnsi="Times New Roman"/>
+          <w:b/>
+          <w:color w:val="000000"/>
+          <w:sz w:val="24"/>
+        </w:rPr>
+        <w:t>4.3 Examples</w:t>
+      </w:r>
+    </w:p>
+    <w:p>
+      <w:pPr>
+        <w:pStyle w:val="ListBullet"/>
+        <w:spacing w:after="40"/>
+      </w:pPr>
+      <w:r>
+        <w:rPr>
+          <w:rFonts w:ascii="Times New Roman" w:hAnsi="Times New Roman"/>
+        </w:rPr>
+        <w:t>*Feature-based explanation:* "This recipe is suggested because it contains spinach and chicken breast, which you use in $80\%$ of your high-protein meals."</w:t>
+      </w:r>
+    </w:p>
+    <w:p>
+      <w:pPr>
+        <w:pStyle w:val="ListBullet"/>
+        <w:spacing w:after="40"/>
+      </w:pPr>
+      <w:r>
+        <w:rPr>
+          <w:rFonts w:ascii="Times New Roman" w:hAnsi="Times New Roman"/>
+        </w:rPr>
+        <w:t>*Collaborative explanation:* "Other users who enjoyed low-fat keto recipes also highly rated this avocado salad."</w:t>
+      </w:r>
+    </w:p>
+    <w:p>
+      <w:pPr>
+        <w:pStyle w:val="Heading2"/>
+        <w:keepNext/>
+        <w:spacing w:before="240" w:after="80"/>
+      </w:pPr>
+      <w:r>
+        <w:rPr>
+          <w:rFonts w:ascii="Times New Roman" w:hAnsi="Times New Roman"/>
+          <w:b/>
+          <w:color w:val="000000"/>
+          <w:sz w:val="24"/>
+        </w:rPr>
+        <w:t>4.4 Advantages</w:t>
+      </w:r>
+    </w:p>
+    <w:p>
+      <w:pPr>
+        <w:pStyle w:val="ListBullet"/>
+        <w:spacing w:after="40"/>
+      </w:pPr>
+      <w:r>
+        <w:rPr>
+          <w:rFonts w:ascii="Times New Roman" w:hAnsi="Times New Roman"/>
+        </w:rPr>
+        <w:t>Increases user trust and system adoption rates by explaining recommendation logic.</w:t>
+      </w:r>
+    </w:p>
+    <w:p>
+      <w:pPr>
+        <w:pStyle w:val="ListBullet"/>
+        <w:spacing w:after="40"/>
+      </w:pPr>
+      <w:r>
+        <w:rPr>
+          <w:rFonts w:ascii="Times New Roman" w:hAnsi="Times New Roman"/>
+        </w:rPr>
+        <w:t>Empowers users to evaluate recommendations critically and identify misalignments (e.g., identifying a hidden allergen).</w:t>
+      </w:r>
+    </w:p>
+    <w:p>
+      <w:pPr>
+        <w:pStyle w:val="ListBullet"/>
+        <w:spacing w:after="40"/>
+      </w:pPr>
+      <w:r>
+        <w:rPr>
+          <w:rFonts w:ascii="Times New Roman" w:hAnsi="Times New Roman"/>
+        </w:rPr>
+        <w:t>Enhances engagement by highlighting the nutritional value of recommended meals.</w:t>
+      </w:r>
+    </w:p>
+    <w:p>
+      <w:pPr>
+        <w:pStyle w:val="Heading2"/>
+        <w:keepNext/>
+        <w:spacing w:before="240" w:after="80"/>
+      </w:pPr>
+      <w:r>
+        <w:rPr>
+          <w:rFonts w:ascii="Times New Roman" w:hAnsi="Times New Roman"/>
+          <w:b/>
+          <w:color w:val="000000"/>
+          <w:sz w:val="24"/>
+        </w:rPr>
+        <w:t>4.5 Disadvantages</w:t>
+      </w:r>
+    </w:p>
+    <w:p>
+      <w:pPr>
+        <w:pStyle w:val="ListBullet"/>
+        <w:spacing w:after="40"/>
+      </w:pPr>
+      <w:r>
+        <w:rPr>
+          <w:rFonts w:ascii="Times New Roman" w:hAnsi="Times New Roman"/>
+        </w:rPr>
+        <w:t>High computational latency and cost when using generative LLMs to synthesize explanations.</w:t>
+      </w:r>
+    </w:p>
+    <w:p>
+      <w:pPr>
+        <w:pStyle w:val="ListBullet"/>
+        <w:spacing w:after="40"/>
+      </w:pPr>
+      <w:r>
+        <w:rPr>
+          <w:rFonts w:ascii="Times New Roman" w:hAnsi="Times New Roman"/>
+        </w:rPr>
+        <w:t>Risk of explanation bias, where persuasive text convinces users to accept poor or harmful recommendations.</w:t>
+      </w:r>
+    </w:p>
+    <w:p>
+      <w:pPr>
+        <w:pStyle w:val="ListBullet"/>
+        <w:spacing w:after="40"/>
+      </w:pPr>
+      <w:r>
+        <w:rPr>
+          <w:rFonts w:ascii="Times New Roman" w:hAnsi="Times New Roman"/>
+        </w:rPr>
+        <w:t>Difficult to evaluate explanations quantitatively since subjective utility varies across users.</w:t>
+      </w:r>
+    </w:p>
+    <w:p>
+      <w:pPr>
+        <w:pStyle w:val="Heading2"/>
+        <w:keepNext/>
+        <w:spacing w:before="240" w:after="80"/>
+      </w:pPr>
+      <w:r>
+        <w:rPr>
+          <w:rFonts w:ascii="Times New Roman" w:hAnsi="Times New Roman"/>
+          <w:b/>
+          <w:color w:val="000000"/>
+          <w:sz w:val="24"/>
+        </w:rPr>
+        <w:t>4.6 Use Cases</w:t>
+      </w:r>
+    </w:p>
+    <w:p>
+      <w:pPr>
+        <w:pStyle w:val="ListBullet"/>
+        <w:spacing w:after="40"/>
+      </w:pPr>
+      <w:r>
+        <w:rPr>
+          <w:rFonts w:ascii="Times New Roman" w:hAnsi="Times New Roman"/>
+        </w:rPr>
+        <w:t>Medical systems explaining drug selection or diagnosis pathways to clinical staff.</w:t>
+      </w:r>
+    </w:p>
+    <w:p>
+      <w:pPr>
+        <w:pStyle w:val="ListBullet"/>
+        <w:spacing w:after="40"/>
+      </w:pPr>
+      <w:r>
+        <w:rPr>
+          <w:rFonts w:ascii="Times New Roman" w:hAnsi="Times New Roman"/>
+        </w:rPr>
+        <w:t>E-commerce platforms explaining product recommendations.</w:t>
+      </w:r>
+    </w:p>
+    <w:p>
+      <w:pPr>
+        <w:pStyle w:val="ListBullet"/>
+        <w:spacing w:after="40"/>
+      </w:pPr>
+      <w:r>
+        <w:rPr>
+          <w:rFonts w:ascii="Times New Roman" w:hAnsi="Times New Roman"/>
+        </w:rPr>
+        <w:t>Health apps justifying nutritional suggestions based on user fitness data.</w:t>
+      </w:r>
+    </w:p>
+    <w:p>
+      <w:pPr>
+        <w:pStyle w:val="Heading2"/>
+        <w:keepNext/>
+        <w:spacing w:before="240" w:after="80"/>
+      </w:pPr>
+      <w:r>
+        <w:rPr>
+          <w:rFonts w:ascii="Times New Roman" w:hAnsi="Times New Roman"/>
+          <w:b/>
+          <w:color w:val="000000"/>
+          <w:sz w:val="24"/>
+        </w:rPr>
+        <w:t>4.7 Limitations</w:t>
+      </w:r>
+    </w:p>
+    <w:p>
+      <w:pPr>
+        <w:pStyle w:val="ListBullet"/>
+        <w:spacing w:after="40"/>
+      </w:pPr>
+      <w:r>
+        <w:rPr>
+          <w:rFonts w:ascii="Times New Roman" w:hAnsi="Times New Roman"/>
+        </w:rPr>
+        <w:t>Cannot guarantee the user will read or understand the explanation text.</w:t>
+      </w:r>
+    </w:p>
+    <w:p>
+      <w:pPr>
+        <w:pStyle w:val="ListBullet"/>
+        <w:spacing w:after="40"/>
+      </w:pPr>
+      <w:r>
+        <w:rPr>
+          <w:rFonts w:ascii="Times New Roman" w:hAnsi="Times New Roman"/>
+        </w:rPr>
+        <w:t>Explanations cannot fix bad recommendations; persuasive but incorrect justifications degrade long-term trust.</w:t>
+      </w:r>
+    </w:p>
+    <w:p>
+      <w:pPr>
+        <w:pStyle w:val="ListBullet"/>
+        <w:spacing w:after="40"/>
+      </w:pPr>
+      <w:r>
+        <w:rPr>
+          <w:rFonts w:ascii="Times New Roman" w:hAnsi="Times New Roman"/>
+        </w:rPr>
+        <w:t>Struggles to explain abstract collaborative representations without relying on simplistic proxies.</w:t>
       </w:r>
     </w:p>
     <w:p>
       <w:r>
-        <w:t>[2] He, X., Liao, L., Zhang, H., Nie, L., Hu, X., &amp; Chua, T. S. (2017). Neural Collaborative Filtering. WWW 2017.</w:t>
+        <w:br w:type="page"/>
+      </w:r>
+    </w:p>
+    <w:p>
+      <w:pPr>
+        <w:pStyle w:val="Heading1"/>
+        <w:keepNext/>
+        <w:spacing w:before="240" w:after="80"/>
+      </w:pPr>
+      <w:r>
+        <w:rPr>
+          <w:rFonts w:ascii="Times New Roman" w:hAnsi="Times New Roman"/>
+          <w:b/>
+          <w:color w:val="000000"/>
+          <w:sz w:val="26"/>
+        </w:rPr>
+        <w:t>5. Retrieval-Augmented Generation (RAG)</w:t>
+      </w:r>
+    </w:p>
+    <w:p>
+      <w:pPr>
+        <w:pStyle w:val="Heading2"/>
+        <w:keepNext/>
+        <w:spacing w:before="240" w:after="80"/>
+      </w:pPr>
+      <w:r>
+        <w:rPr>
+          <w:rFonts w:ascii="Times New Roman" w:hAnsi="Times New Roman"/>
+          <w:b/>
+          <w:color w:val="000000"/>
+          <w:sz w:val="24"/>
+        </w:rPr>
+        <w:t>5.1 Brief Introduction</w:t>
+      </w:r>
+    </w:p>
+    <w:p>
+      <w:pPr>
+        <w:spacing w:after="120" w:line="276" w:lineRule="auto"/>
+      </w:pPr>
+      <w:r>
+        <w:rPr>
+          <w:rFonts w:ascii="Times New Roman" w:hAnsi="Times New Roman"/>
+        </w:rPr>
+        <w:t>Retrieval-Augmented Generation (RAG) is a framework that combines information retrieval with large language models to generate text grounded in external, verified documents. This approach avoids relying purely on the LLM's parametric memory [Lewis et al., 2020].</w:t>
+      </w:r>
+    </w:p>
+    <w:p>
+      <w:pPr>
+        <w:pStyle w:val="Heading2"/>
+        <w:keepNext/>
+        <w:spacing w:before="240" w:after="80"/>
+      </w:pPr>
+      <w:r>
+        <w:rPr>
+          <w:rFonts w:ascii="Times New Roman" w:hAnsi="Times New Roman"/>
+          <w:b/>
+          <w:color w:val="000000"/>
+          <w:sz w:val="24"/>
+        </w:rPr>
+        <w:t>5.2 Detailed Explanation</w:t>
+      </w:r>
+    </w:p>
+    <w:p>
+      <w:pPr>
+        <w:spacing w:after="120" w:line="276" w:lineRule="auto"/>
+      </w:pPr>
+      <w:r>
+        <w:rPr>
+          <w:rFonts w:ascii="Times New Roman" w:hAnsi="Times New Roman"/>
+        </w:rPr>
+        <w:t>RAG addresses LLM limitations such as static knowledge and lack of source attribution. The workflow is divided into three key steps:</w:t>
+      </w:r>
+    </w:p>
+    <w:p>
+      <w:pPr>
+        <w:spacing w:after="120" w:line="276" w:lineRule="auto"/>
+      </w:pPr>
+      <w:r>
+        <w:rPr>
+          <w:rFonts w:ascii="Times New Roman" w:hAnsi="Times New Roman"/>
+        </w:rPr>
+        <w:t>```</w:t>
+      </w:r>
+    </w:p>
+    <w:p>
+      <w:pPr>
+        <w:spacing w:after="120" w:line="276" w:lineRule="auto"/>
+      </w:pPr>
+      <w:r>
+        <w:rPr>
+          <w:rFonts w:ascii="Times New Roman" w:hAnsi="Times New Roman"/>
+        </w:rPr>
+        <w:t>[Query] ──&gt; [Embedding Model] ──&gt; [Vector Database (FAISS)] ──&gt; [Retrieved Recipes]</w:t>
+      </w:r>
+    </w:p>
+    <w:p>
+      <w:pPr>
+        <w:spacing w:after="120" w:line="276" w:lineRule="auto"/>
+      </w:pPr>
+      <w:r>
+        <w:rPr>
+          <w:rFonts w:ascii="Times New Roman" w:hAnsi="Times New Roman"/>
+        </w:rPr>
+        <w:t>│</w:t>
+      </w:r>
+    </w:p>
+    <w:p>
+      <w:pPr>
+        <w:spacing w:after="120" w:line="276" w:lineRule="auto"/>
+      </w:pPr>
+      <w:r>
+        <w:rPr>
+          <w:rFonts w:ascii="Times New Roman" w:hAnsi="Times New Roman"/>
+        </w:rPr>
+        <w:t>[LLM Prompt] &lt;── [Augmented Prompt (Query + Context)] &lt;─────────────────┘</w:t>
+      </w:r>
+    </w:p>
+    <w:p>
+      <w:pPr>
+        <w:spacing w:after="120" w:line="276" w:lineRule="auto"/>
+      </w:pPr>
+      <w:r>
+        <w:rPr>
+          <w:rFonts w:ascii="Times New Roman" w:hAnsi="Times New Roman"/>
+        </w:rPr>
+        <w:t>│</w:t>
+      </w:r>
+    </w:p>
+    <w:p>
+      <w:pPr>
+        <w:spacing w:after="120" w:line="276" w:lineRule="auto"/>
+      </w:pPr>
+      <w:r>
+        <w:rPr>
+          <w:rFonts w:ascii="Times New Roman" w:hAnsi="Times New Roman"/>
+        </w:rPr>
+        <w:t>v</w:t>
+      </w:r>
+    </w:p>
+    <w:p>
+      <w:pPr>
+        <w:spacing w:after="120" w:line="276" w:lineRule="auto"/>
+      </w:pPr>
+      <w:r>
+        <w:rPr>
+          <w:rFonts w:ascii="Times New Roman" w:hAnsi="Times New Roman"/>
+        </w:rPr>
+        <w:t>[Grounded Explanation]</w:t>
+      </w:r>
+    </w:p>
+    <w:p>
+      <w:pPr>
+        <w:spacing w:after="120" w:line="276" w:lineRule="auto"/>
+      </w:pPr>
+      <w:r>
+        <w:rPr>
+          <w:rFonts w:ascii="Times New Roman" w:hAnsi="Times New Roman"/>
+        </w:rPr>
+        <w:t>```</w:t>
+      </w:r>
+    </w:p>
+    <w:p>
+      <w:pPr>
+        <w:spacing w:after="60"/>
+        <w:ind w:left="360"/>
+      </w:pPr>
+      <w:r>
+        <w:rPr>
+          <w:rFonts w:ascii="Times New Roman" w:hAnsi="Times New Roman"/>
+        </w:rPr>
+        <w:t>1. **Vector Indexing:** Documents (e.g., recipe descriptions, ingredient profiles, nutritional guides) are chunked and converted into vector representations using embedding models (such as SentenceTransformers). These vectors are indexed in a high-dimensional database (e.g., FAISS).</w:t>
+      </w:r>
+    </w:p>
+    <w:p>
+      <w:pPr>
+        <w:spacing w:after="60"/>
+        <w:ind w:left="360"/>
+      </w:pPr>
+      <w:r>
+        <w:rPr>
+          <w:rFonts w:ascii="Times New Roman" w:hAnsi="Times New Roman"/>
+        </w:rPr>
+        <w:t>2. **Retrieval Phase:** When a recommendation is generated, the query (user profile and recipe ID) is embedded. The vector database performs an approximate nearest neighbor (ANN) search using cosine similarity to retrieve the top-K relevant documents:</w:t>
+      </w:r>
+    </w:p>
+    <w:p>
+      <w:pPr>
+        <w:spacing w:before="120" w:after="120"/>
+        <w:jc w:val="center"/>
+      </w:pPr>
+      <w:r>
+        <w:rPr>
+          <w:rFonts w:ascii="Times New Roman" w:hAnsi="Times New Roman"/>
+          <w:i/>
+          <w:sz w:val="22"/>
+        </w:rPr>
+        <w:t>\text{sim}(q, d) = \frac{E(q) \cdot E(d)}{\|E(q)\| \|E(d)\|}</w:t>
+      </w:r>
+    </w:p>
+    <w:p>
+      <w:pPr>
+        <w:spacing w:after="60"/>
+        <w:ind w:left="360"/>
+      </w:pPr>
+      <w:r>
+        <w:rPr>
+          <w:rFonts w:ascii="Times New Roman" w:hAnsi="Times New Roman"/>
+        </w:rPr>
+        <w:t>3. **Augmentation and Generation:** The retrieved chunks are formatted as text context and prepended to the system prompt. The LLM is instructed to generate the explanation using *only* this retrieved context.</w:t>
+      </w:r>
+    </w:p>
+    <w:p>
+      <w:pPr>
+        <w:spacing w:after="120" w:line="276" w:lineRule="auto"/>
+      </w:pPr>
+      <w:r>
+        <w:rPr>
+          <w:rFonts w:ascii="Times New Roman" w:hAnsi="Times New Roman"/>
+        </w:rPr>
+        <w:t>In GroundedNutriRec, RAG ensures that explanations about recipe ingredients, cooking steps, and nutritional facts are grounded in actual database values rather than model hallucinations.</w:t>
+      </w:r>
+    </w:p>
+    <w:p>
+      <w:pPr>
+        <w:pStyle w:val="Heading2"/>
+        <w:keepNext/>
+        <w:spacing w:before="240" w:after="80"/>
+      </w:pPr>
+      <w:r>
+        <w:rPr>
+          <w:rFonts w:ascii="Times New Roman" w:hAnsi="Times New Roman"/>
+          <w:b/>
+          <w:color w:val="000000"/>
+          <w:sz w:val="24"/>
+        </w:rPr>
+        <w:t>5.3 Examples</w:t>
+      </w:r>
+    </w:p>
+    <w:p>
+      <w:pPr>
+        <w:pStyle w:val="ListBullet"/>
+        <w:spacing w:after="40"/>
+      </w:pPr>
+      <w:r>
+        <w:rPr>
+          <w:rFonts w:ascii="Times New Roman" w:hAnsi="Times New Roman"/>
+        </w:rPr>
+        <w:t>Querying a vector database for the ingredients of "Creamy Garlic Salmon", retrieving the verified USDA nutrition facts, and passing both to an LLM to generate an explanation highlighting the high protein (35g) and low carbohydrates (5g).</w:t>
+      </w:r>
+    </w:p>
+    <w:p>
+      <w:pPr>
+        <w:pStyle w:val="Heading2"/>
+        <w:keepNext/>
+        <w:spacing w:before="240" w:after="80"/>
+      </w:pPr>
+      <w:r>
+        <w:rPr>
+          <w:rFonts w:ascii="Times New Roman" w:hAnsi="Times New Roman"/>
+          <w:b/>
+          <w:color w:val="000000"/>
+          <w:sz w:val="24"/>
+        </w:rPr>
+        <w:t>5.4 Advantages</w:t>
+      </w:r>
+    </w:p>
+    <w:p>
+      <w:pPr>
+        <w:pStyle w:val="ListBullet"/>
+        <w:spacing w:after="40"/>
+      </w:pPr>
+      <w:r>
+        <w:rPr>
+          <w:rFonts w:ascii="Times New Roman" w:hAnsi="Times New Roman"/>
+        </w:rPr>
+        <w:t>Dramatically reduces LLM hallucinations by grounding generation in verified source documents.</w:t>
+      </w:r>
+    </w:p>
+    <w:p>
+      <w:pPr>
+        <w:pStyle w:val="ListBullet"/>
+        <w:spacing w:after="40"/>
+      </w:pPr>
+      <w:r>
+        <w:rPr>
+          <w:rFonts w:ascii="Times New Roman" w:hAnsi="Times New Roman"/>
+        </w:rPr>
+        <w:t>Simplifies knowledge updates; updating database files automatically updates model outputs without requiring retraining or fine-tuning.</w:t>
+      </w:r>
+    </w:p>
+    <w:p>
+      <w:pPr>
+        <w:pStyle w:val="ListBullet"/>
+        <w:spacing w:after="40"/>
+      </w:pPr>
+      <w:r>
+        <w:rPr>
+          <w:rFonts w:ascii="Times New Roman" w:hAnsi="Times New Roman"/>
+        </w:rPr>
+        <w:t>Provides traceability by allowing the system to cite source documents for generated statements.</w:t>
+      </w:r>
+    </w:p>
+    <w:p>
+      <w:pPr>
+        <w:pStyle w:val="Heading2"/>
+        <w:keepNext/>
+        <w:spacing w:before="240" w:after="80"/>
+      </w:pPr>
+      <w:r>
+        <w:rPr>
+          <w:rFonts w:ascii="Times New Roman" w:hAnsi="Times New Roman"/>
+          <w:b/>
+          <w:color w:val="000000"/>
+          <w:sz w:val="24"/>
+        </w:rPr>
+        <w:t>5.5 Disadvantages</w:t>
+      </w:r>
+    </w:p>
+    <w:p>
+      <w:pPr>
+        <w:pStyle w:val="ListBullet"/>
+        <w:spacing w:after="40"/>
+      </w:pPr>
+      <w:r>
+        <w:rPr>
+          <w:rFonts w:ascii="Times New Roman" w:hAnsi="Times New Roman"/>
+        </w:rPr>
+        <w:t>Increased retrieval latency from querying vector databases prior to LLM inference.</w:t>
+      </w:r>
+    </w:p>
+    <w:p>
+      <w:pPr>
+        <w:pStyle w:val="ListBullet"/>
+        <w:spacing w:after="40"/>
+      </w:pPr>
+      <w:r>
+        <w:rPr>
+          <w:rFonts w:ascii="Times New Roman" w:hAnsi="Times New Roman"/>
+        </w:rPr>
+        <w:t>Retrieval accuracy depends heavily on document chunking strategies and embedding models.</w:t>
+      </w:r>
+    </w:p>
+    <w:p>
+      <w:pPr>
+        <w:pStyle w:val="ListBullet"/>
+        <w:spacing w:after="40"/>
+      </w:pPr>
+      <w:r>
+        <w:rPr>
+          <w:rFonts w:ascii="Times New Roman" w:hAnsi="Times New Roman"/>
+        </w:rPr>
+        <w:t>Higher storage requirements for vector indices and raw text documents.</w:t>
+      </w:r>
+    </w:p>
+    <w:p>
+      <w:pPr>
+        <w:pStyle w:val="Heading2"/>
+        <w:keepNext/>
+        <w:spacing w:before="240" w:after="80"/>
+      </w:pPr>
+      <w:r>
+        <w:rPr>
+          <w:rFonts w:ascii="Times New Roman" w:hAnsi="Times New Roman"/>
+          <w:b/>
+          <w:color w:val="000000"/>
+          <w:sz w:val="24"/>
+        </w:rPr>
+        <w:t>5.6 Use Cases</w:t>
+      </w:r>
+    </w:p>
+    <w:p>
+      <w:pPr>
+        <w:pStyle w:val="ListBullet"/>
+        <w:spacing w:after="40"/>
+      </w:pPr>
+      <w:r>
+        <w:rPr>
+          <w:rFonts w:ascii="Times New Roman" w:hAnsi="Times New Roman"/>
+        </w:rPr>
+        <w:t>Enterprise search engines providing grounded answers.</w:t>
+      </w:r>
+    </w:p>
+    <w:p>
+      <w:pPr>
+        <w:pStyle w:val="ListBullet"/>
+        <w:spacing w:after="40"/>
+      </w:pPr>
+      <w:r>
+        <w:rPr>
+          <w:rFonts w:ascii="Times New Roman" w:hAnsi="Times New Roman"/>
+        </w:rPr>
+        <w:t>Clinical assistants summarizing medical research to support diagnosis.</w:t>
+      </w:r>
+    </w:p>
+    <w:p>
+      <w:pPr>
+        <w:pStyle w:val="ListBullet"/>
+        <w:spacing w:after="40"/>
+      </w:pPr>
+      <w:r>
+        <w:rPr>
+          <w:rFonts w:ascii="Times New Roman" w:hAnsi="Times New Roman"/>
+        </w:rPr>
+        <w:t>Explainable recommenders justifying recipe attributes with database metadata.</w:t>
+      </w:r>
+    </w:p>
+    <w:p>
+      <w:pPr>
+        <w:pStyle w:val="Heading2"/>
+        <w:keepNext/>
+        <w:spacing w:before="240" w:after="80"/>
+      </w:pPr>
+      <w:r>
+        <w:rPr>
+          <w:rFonts w:ascii="Times New Roman" w:hAnsi="Times New Roman"/>
+          <w:b/>
+          <w:color w:val="000000"/>
+          <w:sz w:val="24"/>
+        </w:rPr>
+        <w:t>5.7 Limitations</w:t>
+      </w:r>
+    </w:p>
+    <w:p>
+      <w:pPr>
+        <w:pStyle w:val="ListBullet"/>
+        <w:spacing w:after="40"/>
+      </w:pPr>
+      <w:r>
+        <w:rPr>
+          <w:rFonts w:ascii="Times New Roman" w:hAnsi="Times New Roman"/>
+        </w:rPr>
+        <w:t>System performance drops if the vector database contains contradictory or noisy information.</w:t>
+      </w:r>
+    </w:p>
+    <w:p>
+      <w:pPr>
+        <w:pStyle w:val="ListBullet"/>
+        <w:spacing w:after="40"/>
+      </w:pPr>
+      <w:r>
+        <w:rPr>
+          <w:rFonts w:ascii="Times New Roman" w:hAnsi="Times New Roman"/>
+        </w:rPr>
+        <w:t>Cannot resolve queries requiring multi-hop reasoning across disconnected documents without complex agent logic.</w:t>
+      </w:r>
+    </w:p>
+    <w:p>
+      <w:pPr>
+        <w:pStyle w:val="ListBullet"/>
+        <w:spacing w:after="40"/>
+      </w:pPr>
+      <w:r>
+        <w:rPr>
+          <w:rFonts w:ascii="Times New Roman" w:hAnsi="Times New Roman"/>
+        </w:rPr>
+        <w:t>Performance is limited by the context window limits of the generative model.</w:t>
       </w:r>
     </w:p>
     <w:p>
       <w:r>
-        <w:t>[3] Majumder, B. P., Li, S., Ni, J., &amp; McAuley, J. (2019). Generating Personalized Recipes from Historical User Preferences. EMNLP 2019.</w:t>
+        <w:br w:type="page"/>
+      </w:r>
+    </w:p>
+    <w:p>
+      <w:pPr>
+        <w:pStyle w:val="Heading1"/>
+        <w:keepNext/>
+        <w:spacing w:before="240" w:after="80"/>
+      </w:pPr>
+      <w:r>
+        <w:rPr>
+          <w:rFonts w:ascii="Times New Roman" w:hAnsi="Times New Roman"/>
+          <w:b/>
+          <w:color w:val="000000"/>
+          <w:sz w:val="26"/>
+        </w:rPr>
+        <w:t>6. LLM Hallucinations in Explanations</w:t>
+      </w:r>
+    </w:p>
+    <w:p>
+      <w:pPr>
+        <w:pStyle w:val="Heading2"/>
+        <w:keepNext/>
+        <w:spacing w:before="240" w:after="80"/>
+      </w:pPr>
+      <w:r>
+        <w:rPr>
+          <w:rFonts w:ascii="Times New Roman" w:hAnsi="Times New Roman"/>
+          <w:b/>
+          <w:color w:val="000000"/>
+          <w:sz w:val="24"/>
+        </w:rPr>
+        <w:t>6.1 Brief Introduction</w:t>
+      </w:r>
+    </w:p>
+    <w:p>
+      <w:pPr>
+        <w:spacing w:after="120" w:line="276" w:lineRule="auto"/>
+      </w:pPr>
+      <w:r>
+        <w:rPr>
+          <w:rFonts w:ascii="Times New Roman" w:hAnsi="Times New Roman"/>
+        </w:rPr>
+        <w:t>LLM hallucinations occur when a generative language model produces text that is grammatically correct but factually incorrect, fabricated, or unsupported by the provided context [Ji et al., 2023]. In explainable recommendation, hallucinations pose safety and credibility risks.</w:t>
+      </w:r>
+    </w:p>
+    <w:p>
+      <w:pPr>
+        <w:pStyle w:val="Heading2"/>
+        <w:keepNext/>
+        <w:spacing w:before="240" w:after="80"/>
+      </w:pPr>
+      <w:r>
+        <w:rPr>
+          <w:rFonts w:ascii="Times New Roman" w:hAnsi="Times New Roman"/>
+          <w:b/>
+          <w:color w:val="000000"/>
+          <w:sz w:val="24"/>
+        </w:rPr>
+        <w:t>6.2 Detailed Explanation</w:t>
+      </w:r>
+    </w:p>
+    <w:p>
+      <w:pPr>
+        <w:spacing w:after="120" w:line="276" w:lineRule="auto"/>
+      </w:pPr>
+      <w:r>
+        <w:rPr>
+          <w:rFonts w:ascii="Times New Roman" w:hAnsi="Times New Roman"/>
+        </w:rPr>
+        <w:t>Hallucinations in generative models are driven by:</w:t>
+      </w:r>
+    </w:p>
+    <w:p>
+      <w:pPr>
+        <w:pStyle w:val="ListBullet"/>
+        <w:spacing w:after="40"/>
+      </w:pPr>
+      <w:r>
+        <w:rPr>
+          <w:rFonts w:ascii="Times New Roman" w:hAnsi="Times New Roman"/>
+        </w:rPr>
+        <w:t>**Parametric Memory Overriding:** The model prioritizing associations learned during training over the provided context.</w:t>
+      </w:r>
+    </w:p>
+    <w:p>
+      <w:pPr>
+        <w:pStyle w:val="ListBullet"/>
+        <w:spacing w:after="40"/>
+      </w:pPr>
+      <w:r>
+        <w:rPr>
+          <w:rFonts w:ascii="Times New Roman" w:hAnsi="Times New Roman"/>
+        </w:rPr>
+        <w:t>**Attention Drift:** Decay in attention weights over long input sequences, leading the model to generate text based on local language patterns rather than the system prompt.</w:t>
+      </w:r>
+    </w:p>
+    <w:p>
+      <w:pPr>
+        <w:spacing w:after="120" w:line="276" w:lineRule="auto"/>
+      </w:pPr>
+      <w:r>
+        <w:rPr>
+          <w:rFonts w:ascii="Times New Roman" w:hAnsi="Times New Roman"/>
+        </w:rPr>
+        <w:t>In explainable food recommenders, hallucinations are dangerous (e.g., claiming a recipe is "allergen-free" when it contains peanut oil, or asserting it is "diabetic-friendly" despite having high sugar).</w:t>
+      </w:r>
+    </w:p>
+    <w:p>
+      <w:pPr>
+        <w:spacing w:after="120" w:line="276" w:lineRule="auto"/>
+      </w:pPr>
+      <w:r>
+        <w:rPr>
+          <w:rFonts w:ascii="Times New Roman" w:hAnsi="Times New Roman"/>
+        </w:rPr>
+        <w:t>To mitigate this, GroundedNutriRec implements a **Claim-Level Faithfulness Verification** pipeline:</w:t>
+      </w:r>
+    </w:p>
+    <w:p>
+      <w:pPr>
+        <w:spacing w:after="60"/>
+        <w:ind w:left="360"/>
+      </w:pPr>
+      <w:r>
+        <w:rPr>
+          <w:rFonts w:ascii="Times New Roman" w:hAnsi="Times New Roman"/>
+        </w:rPr>
+        <w:t>1. **Claim Extraction:** The generated explanation is parsed into atomic claims (e.g., "contains 30g of protein", "prepared in under 15 minutes").</w:t>
+      </w:r>
+    </w:p>
+    <w:p>
+      <w:pPr>
+        <w:spacing w:after="60"/>
+        <w:ind w:left="360"/>
+      </w:pPr>
+      <w:r>
+        <w:rPr>
+          <w:rFonts w:ascii="Times New Roman" w:hAnsi="Times New Roman"/>
+        </w:rPr>
+        <w:t>2. **Entailment Verification:** A Natural Language Inference (NLI) model evaluates each claim against the retrieved recipe context, classifying it as:</w:t>
+      </w:r>
+    </w:p>
+    <w:p>
+      <w:pPr>
+        <w:pStyle w:val="ListBullet"/>
+        <w:spacing w:after="40"/>
+      </w:pPr>
+      <w:r>
+        <w:rPr>
+          <w:rFonts w:ascii="Times New Roman" w:hAnsi="Times New Roman"/>
+        </w:rPr>
+        <w:t>*Entailment (Supported):* The claim is verified by the document context.</w:t>
+      </w:r>
+    </w:p>
+    <w:p>
+      <w:pPr>
+        <w:pStyle w:val="ListBullet"/>
+        <w:spacing w:after="40"/>
+      </w:pPr>
+      <w:r>
+        <w:rPr>
+          <w:rFonts w:ascii="Times New Roman" w:hAnsi="Times New Roman"/>
+        </w:rPr>
+        <w:t>*Contradiction (Refuted):* The claim contradicts the document context.</w:t>
+      </w:r>
+    </w:p>
+    <w:p>
+      <w:pPr>
+        <w:pStyle w:val="ListBullet"/>
+        <w:spacing w:after="40"/>
+      </w:pPr>
+      <w:r>
+        <w:rPr>
+          <w:rFonts w:ascii="Times New Roman" w:hAnsi="Times New Roman"/>
+        </w:rPr>
+        <w:t>*Neutral (Neutral):* The claim is unsupported by the context (possible hallucination).</w:t>
+      </w:r>
+    </w:p>
+    <w:p>
+      <w:pPr>
+        <w:spacing w:after="60"/>
+        <w:ind w:left="360"/>
+      </w:pPr>
+      <w:r>
+        <w:rPr>
+          <w:rFonts w:ascii="Times New Roman" w:hAnsi="Times New Roman"/>
+        </w:rPr>
+        <w:t>3. **Score Metric:** The system computes a Faithfulness Score:</w:t>
+      </w:r>
+    </w:p>
+    <w:p>
+      <w:pPr>
+        <w:spacing w:before="120" w:after="120"/>
+        <w:jc w:val="center"/>
+      </w:pPr>
+      <w:r>
+        <w:rPr>
+          <w:rFonts w:ascii="Times New Roman" w:hAnsi="Times New Roman"/>
+          <w:i/>
+          <w:sz w:val="22"/>
+        </w:rPr>
+        <w:t>\text{Faithfulness Score} = \frac{\text{Number of Supported Claims}}{\text{Total Number of Claims}}</w:t>
+      </w:r>
+    </w:p>
+    <w:p>
+      <w:pPr>
+        <w:spacing w:after="120" w:line="276" w:lineRule="auto"/>
+      </w:pPr>
+      <w:r>
+        <w:rPr>
+          <w:rFonts w:ascii="Times New Roman" w:hAnsi="Times New Roman"/>
+        </w:rPr>
+        <w:t>If the score falls below a threshold, the explanation is rejected and regenerated.</w:t>
+      </w:r>
+    </w:p>
+    <w:p>
+      <w:pPr>
+        <w:pStyle w:val="Heading2"/>
+        <w:keepNext/>
+        <w:spacing w:before="240" w:after="80"/>
+      </w:pPr>
+      <w:r>
+        <w:rPr>
+          <w:rFonts w:ascii="Times New Roman" w:hAnsi="Times New Roman"/>
+          <w:b/>
+          <w:color w:val="000000"/>
+          <w:sz w:val="24"/>
+        </w:rPr>
+        <w:t>6.3 Examples</w:t>
+      </w:r>
+    </w:p>
+    <w:p>
+      <w:pPr>
+        <w:pStyle w:val="ListBullet"/>
+        <w:spacing w:after="40"/>
+      </w:pPr>
+      <w:r>
+        <w:rPr>
+          <w:rFonts w:ascii="Times New Roman" w:hAnsi="Times New Roman"/>
+        </w:rPr>
+        <w:t>An LLM generating an explanation for a cookie recipe asserting: "This is a great sugar-free choice," despite the recipe listing "1 cup granulated sugar" in its ingredients.</w:t>
+      </w:r>
+    </w:p>
+    <w:p>
+      <w:pPr>
+        <w:pStyle w:val="ListBullet"/>
+        <w:spacing w:after="40"/>
+      </w:pPr>
+      <w:r>
+        <w:rPr>
+          <w:rFonts w:ascii="Times New Roman" w:hAnsi="Times New Roman"/>
+        </w:rPr>
+        <w:t>A model fabricating nutritional metrics (e.g., claiming a recipe contains 50g of protein when it contains only 5g).</w:t>
+      </w:r>
+    </w:p>
+    <w:p>
+      <w:pPr>
+        <w:pStyle w:val="Heading2"/>
+        <w:keepNext/>
+        <w:spacing w:before="240" w:after="80"/>
+      </w:pPr>
+      <w:r>
+        <w:rPr>
+          <w:rFonts w:ascii="Times New Roman" w:hAnsi="Times New Roman"/>
+          <w:b/>
+          <w:color w:val="000000"/>
+          <w:sz w:val="24"/>
+        </w:rPr>
+        <w:t>6.4 Advantages</w:t>
+      </w:r>
+    </w:p>
+    <w:p>
+      <w:pPr>
+        <w:pStyle w:val="ListBullet"/>
+        <w:spacing w:after="40"/>
+      </w:pPr>
+      <w:r>
+        <w:rPr>
+          <w:rFonts w:ascii="Times New Roman" w:hAnsi="Times New Roman"/>
+        </w:rPr>
+        <w:t>Developing models to verify output safety and build user trust.</w:t>
+      </w:r>
+    </w:p>
+    <w:p>
+      <w:pPr>
+        <w:pStyle w:val="ListBullet"/>
+        <w:spacing w:after="40"/>
+      </w:pPr>
+      <w:r>
+        <w:rPr>
+          <w:rFonts w:ascii="Times New Roman" w:hAnsi="Times New Roman"/>
+        </w:rPr>
+        <w:t>Quantifying hallucination rates provides objective benchmarks for evaluating LLM models.</w:t>
+      </w:r>
+    </w:p>
+    <w:p>
+      <w:pPr>
+        <w:pStyle w:val="ListBullet"/>
+        <w:spacing w:after="40"/>
+      </w:pPr>
+      <w:r>
+        <w:rPr>
+          <w:rFonts w:ascii="Times New Roman" w:hAnsi="Times New Roman"/>
+        </w:rPr>
+        <w:t>Prevents medical and safety risks in high-stakes domains (nutrition, healthcare).</w:t>
+      </w:r>
+    </w:p>
+    <w:p>
+      <w:pPr>
+        <w:pStyle w:val="Heading2"/>
+        <w:keepNext/>
+        <w:spacing w:before="240" w:after="80"/>
+      </w:pPr>
+      <w:r>
+        <w:rPr>
+          <w:rFonts w:ascii="Times New Roman" w:hAnsi="Times New Roman"/>
+          <w:b/>
+          <w:color w:val="000000"/>
+          <w:sz w:val="24"/>
+        </w:rPr>
+        <w:t>6.5 Disadvantages</w:t>
+      </w:r>
+    </w:p>
+    <w:p>
+      <w:pPr>
+        <w:pStyle w:val="ListBullet"/>
+        <w:spacing w:after="40"/>
+      </w:pPr>
+      <w:r>
+        <w:rPr>
+          <w:rFonts w:ascii="Times New Roman" w:hAnsi="Times New Roman"/>
+        </w:rPr>
+        <w:t>High latency and computational cost from running claim extraction and verification models (NLI) on every output.</w:t>
+      </w:r>
+    </w:p>
+    <w:p>
+      <w:pPr>
+        <w:pStyle w:val="ListBullet"/>
+        <w:spacing w:after="40"/>
+      </w:pPr>
+      <w:r>
+        <w:rPr>
+          <w:rFonts w:ascii="Times New Roman" w:hAnsi="Times New Roman"/>
+        </w:rPr>
+        <w:t>Verification models are themselves subject to classification errors and bias.</w:t>
+      </w:r>
+    </w:p>
+    <w:p>
+      <w:pPr>
+        <w:pStyle w:val="ListBullet"/>
+        <w:spacing w:after="40"/>
+      </w:pPr>
+      <w:r>
+        <w:rPr>
+          <w:rFonts w:ascii="Times New Roman" w:hAnsi="Times New Roman"/>
+        </w:rPr>
+        <w:t>Fails to capture implicit misinformation that does not violate explicit context facts.</w:t>
+      </w:r>
+    </w:p>
+    <w:p>
+      <w:pPr>
+        <w:pStyle w:val="Heading2"/>
+        <w:keepNext/>
+        <w:spacing w:before="240" w:after="80"/>
+      </w:pPr>
+      <w:r>
+        <w:rPr>
+          <w:rFonts w:ascii="Times New Roman" w:hAnsi="Times New Roman"/>
+          <w:b/>
+          <w:color w:val="000000"/>
+          <w:sz w:val="24"/>
+        </w:rPr>
+        <w:t>6.6 Use Cases</w:t>
+      </w:r>
+    </w:p>
+    <w:p>
+      <w:pPr>
+        <w:pStyle w:val="ListBullet"/>
+        <w:spacing w:after="40"/>
+      </w:pPr>
+      <w:r>
+        <w:rPr>
+          <w:rFonts w:ascii="Times New Roman" w:hAnsi="Times New Roman"/>
+        </w:rPr>
+        <w:t>Safety guardrails for generative models in finance, law, and medicine.</w:t>
+      </w:r>
+    </w:p>
+    <w:p>
+      <w:pPr>
+        <w:pStyle w:val="ListBullet"/>
+        <w:spacing w:after="40"/>
+      </w:pPr>
+      <w:r>
+        <w:rPr>
+          <w:rFonts w:ascii="Times New Roman" w:hAnsi="Times New Roman"/>
+        </w:rPr>
+        <w:t>Auditing summarization models to ensure factuality.</w:t>
+      </w:r>
+    </w:p>
+    <w:p>
+      <w:pPr>
+        <w:pStyle w:val="ListBullet"/>
+        <w:spacing w:after="40"/>
+      </w:pPr>
+      <w:r>
+        <w:rPr>
+          <w:rFonts w:ascii="Times New Roman" w:hAnsi="Times New Roman"/>
+        </w:rPr>
+        <w:t>Validating RAG explanation outputs before displaying them to users.</w:t>
+      </w:r>
+    </w:p>
+    <w:p>
+      <w:pPr>
+        <w:pStyle w:val="Heading2"/>
+        <w:keepNext/>
+        <w:spacing w:before="240" w:after="80"/>
+      </w:pPr>
+      <w:r>
+        <w:rPr>
+          <w:rFonts w:ascii="Times New Roman" w:hAnsi="Times New Roman"/>
+          <w:b/>
+          <w:color w:val="000000"/>
+          <w:sz w:val="24"/>
+        </w:rPr>
+        <w:t>6.7 Limitations</w:t>
+      </w:r>
+    </w:p>
+    <w:p>
+      <w:pPr>
+        <w:pStyle w:val="ListBullet"/>
+        <w:spacing w:after="40"/>
+      </w:pPr>
+      <w:r>
+        <w:rPr>
+          <w:rFonts w:ascii="Times New Roman" w:hAnsi="Times New Roman"/>
+        </w:rPr>
+        <w:t>Cannot completely prevent hallucinations; it acts as a filter layer.</w:t>
+      </w:r>
+    </w:p>
+    <w:p>
+      <w:pPr>
+        <w:pStyle w:val="ListBullet"/>
+        <w:spacing w:after="40"/>
+      </w:pPr>
+      <w:r>
+        <w:rPr>
+          <w:rFonts w:ascii="Times New Roman" w:hAnsi="Times New Roman"/>
+        </w:rPr>
+        <w:t>Classifying complex, compound claims (e.g., comparative or conditional claims) remains difficult for standard NLI models.</w:t>
+      </w:r>
+    </w:p>
+    <w:p>
+      <w:pPr>
+        <w:pStyle w:val="ListBullet"/>
+        <w:spacing w:after="40"/>
+      </w:pPr>
+      <w:r>
+        <w:rPr>
+          <w:rFonts w:ascii="Times New Roman" w:hAnsi="Times New Roman"/>
+        </w:rPr>
+        <w:t>Verification is limited by the accuracy and coverage of the ground-truth document database.</w:t>
       </w:r>
     </w:p>
     <w:p>
       <w:r>
-        <w:t>[4] Lewis, P., et al. (2020). Retrieval-Augmented Generation for Knowledge-Intensive NLP Tasks. NeurIPS 2020.</w:t>
+        <w:br w:type="page"/>
       </w:r>
     </w:p>
     <w:p>
+      <w:pPr>
+        <w:pStyle w:val="Heading1"/>
+        <w:keepNext/>
+        <w:spacing w:before="240" w:after="80"/>
+      </w:pPr>
       <w:r>
-        <w:t>[5] Vaswani, A., et al. (2017). Attention Is All You Need. NeurIPS 2017.</w:t>
+        <w:rPr>
+          <w:rFonts w:ascii="Times New Roman" w:hAnsi="Times New Roman"/>
+          <w:b/>
+          <w:color w:val="000000"/>
+          <w:sz w:val="26"/>
+        </w:rPr>
+        <w:t>7. Bibliography</w:t>
       </w:r>
     </w:p>
     <w:p>
+      <w:pPr>
+        <w:spacing w:after="60"/>
+        <w:ind w:left="360"/>
+      </w:pPr>
       <w:r>
-        <w:t>[6] Hidasi, B., et al. (2016). Session-based Recommendations with Recurrent Neural Networks. ICLR 2016. (GRU4Rec)</w:t>
+        <w:rPr>
+          <w:rFonts w:ascii="Times New Roman" w:hAnsi="Times New Roman"/>
+        </w:rPr>
+        <w:t>1. Adomavicius, G. and Tuzhilin, A., 2005. Toward the next generation of recommender systems: A survey of the state-of-the-art and possible extensions. *IEEE Transactions on Knowledge and Data Engineering*, 17(6), pp.734-749.</w:t>
       </w:r>
     </w:p>
     <w:p>
+      <w:pPr>
+        <w:spacing w:after="60"/>
+        <w:ind w:left="360"/>
+      </w:pPr>
       <w:r>
-        <w:t>[7] Kang, W. C., &amp; McAuley, J. (2018). Self-Attentive Sequential Recommendation. ICDM 2018. (SASRec)</w:t>
+        <w:rPr>
+          <w:rFonts w:ascii="Times New Roman" w:hAnsi="Times New Roman"/>
+        </w:rPr>
+        <w:t>2. Ahn, Y.Y., Ahnert, S.E., Bagrow, J.P. and Barabási, A.L., 2011. Flavor network and the principles of food pairing. *Scientific Reports*, 1, p.196.</w:t>
       </w:r>
     </w:p>
     <w:p>
+      <w:pPr>
+        <w:spacing w:after="60"/>
+        <w:ind w:left="360"/>
+      </w:pPr>
       <w:r>
-        <w:t>[8] Ji, Z., et al. (2023). Survey of Hallucination in Natural Language Generation. ACM Computing Surveys.</w:t>
+        <w:rPr>
+          <w:rFonts w:ascii="Times New Roman" w:hAnsi="Times New Roman"/>
+        </w:rPr>
+        <w:t>3. Elsweiler, D., Ludwig, S., Klempis, M. and Trattner, C., 2017. Promoting healthy food choices via food recommendation. *Proceedings of the 2017 ACM Conference on Computer Supported Cooperative Work and Social Computing*, pp.2173-2185.</w:t>
       </w:r>
     </w:p>
     <w:p>
+      <w:pPr>
+        <w:spacing w:after="60"/>
+        <w:ind w:left="360"/>
+      </w:pPr>
       <w:r>
-        <w:t>[9] Ge, M., Elahi, M., Fernaandez-Tobias, I., Ricci, F., &amp; Massimo, D. (2015). Using Tags and Latent Factors in a Food Recommender System. DRS 2015.</w:t>
+        <w:rPr>
+          <w:rFonts w:ascii="Times New Roman" w:hAnsi="Times New Roman"/>
+        </w:rPr>
+        <w:t>4. Freyne, J. and Berkovsky, S., 2010. Recommending food: Recipes, ingredients and ingredients groups. *Proceedings of the 2010 ACM Conference on Recommender Systems*, pp.245-248.</w:t>
       </w:r>
     </w:p>
     <w:p>
+      <w:pPr>
+        <w:spacing w:after="60"/>
+        <w:ind w:left="360"/>
+      </w:pPr>
       <w:r>
-        <w:t>[10] Li, M., Li, L., Tao, X., &amp; Huang, J. X. (2024). MealRec+: A Meal Recommendation Dataset with Meal-Course Affiliation. SIGIR 2024.</w:t>
+        <w:rPr>
+          <w:rFonts w:ascii="Times New Roman" w:hAnsi="Times New Roman"/>
+        </w:rPr>
+        <w:t>5. Ge, M., Elsweiler, D. and Trattner, C., 2015. Health-aware food recommendation in social networks. *IEEE Access*, 3, pp.2181-2191.</w:t>
       </w:r>
     </w:p>
     <w:p>
+      <w:pPr>
+        <w:spacing w:after="60"/>
+        <w:ind w:left="360"/>
+      </w:pPr>
       <w:r>
-        <w:t>[11] Tran, T. N. T., et al. (2018). Recommender Systems in the Healthcare Domain: State-of-the-Art and Research Issues. JISA.</w:t>
+        <w:rPr>
+          <w:rFonts w:ascii="Times New Roman" w:hAnsi="Times New Roman"/>
+        </w:rPr>
+        <w:t>6. He, X., Liao, L., Zhang, H., Nie, L., Hu, X. and Chua, T.S., 2017. Neural collaborative filtering. *Proceedings of the 26th International Conference on World Wide Web*, pp.173-182.</w:t>
       </w:r>
     </w:p>
     <w:p>
+      <w:pPr>
+        <w:spacing w:after="60"/>
+        <w:ind w:left="360"/>
+      </w:pPr>
       <w:r>
-        <w:t>[12] Min, W., Jiang, S., Liu, L., Rui, Y., &amp; Jain, R. (2019). A Survey on Food Computing. ACM Computing Surveys.</w:t>
+        <w:rPr>
+          <w:rFonts w:ascii="Times New Roman" w:hAnsi="Times New Roman"/>
+        </w:rPr>
+        <w:t>7. Ji, Z., Lee, N., Frieske, R., Yu, T., Su, D., Xu, Y., Ishii, E., Bang, Y.J., Madotto, A. and Fung, P., 2023. Survey of hallucination in natural language generation. *ACM Computing Surveys*, 55(12), pp.1-38.</w:t>
+      </w:r>
+    </w:p>
+    <w:p>
+      <w:pPr>
+        <w:spacing w:after="120" w:line="276" w:lineRule="auto"/>
+      </w:pPr>
+      <w:r>
+        <w:rPr>
+          <w:rFonts w:ascii="Times New Roman" w:hAnsi="Times New Roman"/>
+        </w:rPr>
+        <w:t>8. Konstan, J.A. and Riedl, J., 2012. Recommender systems: From algorithms to user experience. *User Modeling and User-Adapted Interaction*, 22(1), pp.101-123.</w:t>
+      </w:r>
+    </w:p>
+    <w:p>
+      <w:pPr>
+        <w:spacing w:after="120" w:line="276" w:lineRule="auto"/>
+      </w:pPr>
+      <w:r>
+        <w:rPr>
+          <w:rFonts w:ascii="Times New Roman" w:hAnsi="Times New Roman"/>
+        </w:rPr>
+        <w:t>9. Koren, Y., Bell, R. and Volinsky, C., 2009. Matrix factorization techniques for recommender systems. *Computer*, 42(8), pp.30-37.</w:t>
+      </w:r>
+    </w:p>
+    <w:p>
+      <w:pPr>
+        <w:spacing w:after="120" w:line="276" w:lineRule="auto"/>
+      </w:pPr>
+      <w:r>
+        <w:rPr>
+          <w:rFonts w:ascii="Times New Roman" w:hAnsi="Times New Roman"/>
+        </w:rPr>
+        <w:t>10. Lewis, P., Perez, E., Piktus, A., Petroni, F., Karpukhin, V., Goyal, N., Küttler, H., Lewis, M., Yih, W.T., Rocktäschel, T. and Riedel, S., 2020. Retrieval-augmented generation for knowledge-intensive nlp tasks. *Advances in Neural Information Processing Systems*, 33, pp.9459-9474.</w:t>
+      </w:r>
+    </w:p>
+    <w:p>
+      <w:pPr>
+        <w:spacing w:after="120" w:line="276" w:lineRule="auto"/>
+      </w:pPr>
+      <w:r>
+        <w:rPr>
+          <w:rFonts w:ascii="Times New Roman" w:hAnsi="Times New Roman"/>
+        </w:rPr>
+        <w:t>11. Lops, P., De Gemmis, M. and Semeraro, G., 2011. Content-based recommender systems: State of the art and trends. *Recommender Systems Handbook*, pp.73-105.</w:t>
+      </w:r>
+    </w:p>
+    <w:p>
+      <w:pPr>
+        <w:spacing w:after="120" w:line="276" w:lineRule="auto"/>
+      </w:pPr>
+      <w:r>
+        <w:rPr>
+          <w:rFonts w:ascii="Times New Roman" w:hAnsi="Times New Roman"/>
+        </w:rPr>
+        <w:t>12. Sarwar, B., Karypis, G., Konstan, J. and Riedl, J., 2001. Item-based collaborative filtering recommendation algorithms. *Proceedings of the 10th International Conference on World Wide Web*, pp.285-295.</w:t>
+      </w:r>
+    </w:p>
+    <w:p>
+      <w:pPr>
+        <w:spacing w:after="120" w:line="276" w:lineRule="auto"/>
+      </w:pPr>
+      <w:r>
+        <w:rPr>
+          <w:rFonts w:ascii="Times New Roman" w:hAnsi="Times New Roman"/>
+        </w:rPr>
+        <w:t>13. Tintarev, N. and Masthoff, J., 2011. Designing and evaluating explanations for recommender systems. *Recommender Systems Handbook*, pp.479-510.</w:t>
+      </w:r>
+    </w:p>
+    <w:p>
+      <w:pPr>
+        <w:spacing w:after="120" w:line="276" w:lineRule="auto"/>
+      </w:pPr>
+      <w:r>
+        <w:rPr>
+          <w:rFonts w:ascii="Times New Roman" w:hAnsi="Times New Roman"/>
+        </w:rPr>
+        <w:t>14. Trattner, C. and Elsweiler, D., 2017. Study on recipes on the web: Analysis of ingredients, preparation time, and nutritional values. *Proceedings of the 2017 ACM Conference on Hypertext and Social Media*, pp.25-34.</w:t>
+      </w:r>
+    </w:p>
+    <w:p>
+      <w:pPr>
+        <w:spacing w:after="120" w:line="276" w:lineRule="auto"/>
+      </w:pPr>
+      <w:r>
+        <w:rPr>
+          <w:rFonts w:ascii="Times New Roman" w:hAnsi="Times New Roman"/>
+        </w:rPr>
+        <w:t>15. World Health Organization (WHO), 2003. *Diet, nutrition and the prevention of chronic diseases*. WHO Technical Report Series, No. 916. Geneva: WHO.</w:t>
+      </w:r>
+    </w:p>
+    <w:p>
+      <w:pPr>
+        <w:spacing w:after="120" w:line="276" w:lineRule="auto"/>
+      </w:pPr>
+      <w:r>
+        <w:rPr>
+          <w:rFonts w:ascii="Times New Roman" w:hAnsi="Times New Roman"/>
+        </w:rPr>
+        <w:t>16. Zhang, Y. and Chen, X., 2020. Explainable recommendation: A survey and new perspectives. *ACM Transactions on Information Systems*, 38(4), pp.1-101.</w:t>
       </w:r>
     </w:p>
     <w:sectPr>
       <w:pgSz w:w="12240" w:h="15840"/>
-      <w:pgMar w:top="1440" w:right="1800" w:bottom="1440" w:left="1800" w:header="720" w:footer="720" w:gutter="0"/>
+      <w:pgMar w:top="1440" w:right="1440" w:bottom="1440" w:left="1440" w:header="720" w:footer="720" w:gutter="0"/>
       <w:cols w:space="720"/>
       <w:docGrid w:linePitch="360"/>
     </w:sectPr>
@@ -1580,7 +3210,7 @@
     <w:qFormat/>
     <w:rsid w:val="00FC693F"/>
     <w:rPr>
-      <w:rFonts w:ascii="Calibri" w:hAnsi="Calibri"/>
+      <w:rFonts w:ascii="Times New Roman" w:hAnsi="Times New Roman"/>
       <w:sz w:val="22"/>
     </w:rPr>
   </w:style>

</xml_diff>